<commit_message>
Dev Ops - End Modul 2
</commit_message>
<xml_diff>
--- a/3_DataEngineering/3_1_DataEng-Fund-SQL-Python/docs/k5_m2_Foundations of Modern Data Engineering.docx
+++ b/3_DataEngineering/3_1_DataEng-Fund-SQL-Python/docs/k5_m2_Foundations of Modern Data Engineering.docx
@@ -44,45 +44,6 @@
             <wp:extent cx="6858000" cy="4090035"/>
             <wp:effectExtent l="0" t="0" r="0" b="5715"/>
             <wp:docPr id="1" name="Grafik 1"/>
-            <wp:cNvGraphicFramePr>
-              <a:graphicFrameLocks xmlns:a="http://schemas.openxmlformats.org/drawingml/2006/main" noChangeAspect="1"/>
-            </wp:cNvGraphicFramePr>
-            <a:graphic xmlns:a="http://schemas.openxmlformats.org/drawingml/2006/main">
-              <a:graphicData uri="http://schemas.openxmlformats.org/drawingml/2006/picture">
-                <pic:pic xmlns:pic="http://schemas.openxmlformats.org/drawingml/2006/picture">
-                  <pic:nvPicPr>
-                    <pic:cNvPr id="1" name=""/>
-                    <pic:cNvPicPr/>
-                  </pic:nvPicPr>
-                  <pic:blipFill>
-                    <a:blip r:embed="rId4"/>
-                    <a:stretch>
-                      <a:fillRect/>
-                    </a:stretch>
-                  </pic:blipFill>
-                  <pic:spPr>
-                    <a:xfrm>
-                      <a:off x="0" y="0"/>
-                      <a:ext cx="6858000" cy="4090035"/>
-                    </a:xfrm>
-                    <a:prstGeom prst="rect">
-                      <a:avLst/>
-                    </a:prstGeom>
-                  </pic:spPr>
-                </pic:pic>
-              </a:graphicData>
-            </a:graphic>
-          </wp:inline>
-        </w:drawing>
-      </w:r>
-    </w:p>
-    <w:p>
-      <w:r>
-        <w:drawing>
-          <wp:inline distT="0" distB="0" distL="0" distR="0" wp14:anchorId="6D7585D9" wp14:editId="308FC4E2">
-            <wp:extent cx="6858000" cy="3656330"/>
-            <wp:effectExtent l="0" t="0" r="0" b="1270"/>
-            <wp:docPr id="12" name="Grafik 12"/>
             <wp:cNvGraphicFramePr>
               <a:graphicFrameLocks xmlns:a="http://schemas.openxmlformats.org/drawingml/2006/main" noChangeAspect="1"/>
             </wp:cNvGraphicFramePr>
@@ -102,7 +63,7 @@
                   <pic:spPr>
                     <a:xfrm>
                       <a:off x="0" y="0"/>
-                      <a:ext cx="6858000" cy="3656330"/>
+                      <a:ext cx="6858000" cy="4090035"/>
                     </a:xfrm>
                     <a:prstGeom prst="rect">
                       <a:avLst/>
@@ -117,12 +78,11 @@
     </w:p>
     <w:p>
       <w:r>
-        <w:lastRenderedPageBreak/>
         <w:drawing>
-          <wp:inline distT="0" distB="0" distL="0" distR="0" wp14:anchorId="5B9E9B07" wp14:editId="34AAAD0A">
-            <wp:extent cx="6858000" cy="3674745"/>
-            <wp:effectExtent l="0" t="0" r="0" b="1905"/>
-            <wp:docPr id="13" name="Grafik 13"/>
+          <wp:inline distT="0" distB="0" distL="0" distR="0" wp14:anchorId="6D7585D9" wp14:editId="308FC4E2">
+            <wp:extent cx="6858000" cy="3656330"/>
+            <wp:effectExtent l="0" t="0" r="0" b="1270"/>
+            <wp:docPr id="12" name="Grafik 12"/>
             <wp:cNvGraphicFramePr>
               <a:graphicFrameLocks xmlns:a="http://schemas.openxmlformats.org/drawingml/2006/main" noChangeAspect="1"/>
             </wp:cNvGraphicFramePr>
@@ -142,6 +102,51 @@
                   <pic:spPr>
                     <a:xfrm>
                       <a:off x="0" y="0"/>
+                      <a:ext cx="6858000" cy="3656330"/>
+                    </a:xfrm>
+                    <a:prstGeom prst="rect">
+                      <a:avLst/>
+                    </a:prstGeom>
+                  </pic:spPr>
+                </pic:pic>
+              </a:graphicData>
+            </a:graphic>
+          </wp:inline>
+        </w:drawing>
+      </w:r>
+    </w:p>
+    <w:p>
+      <w:pPr>
+        <w:rPr>
+          <w:lang w:val="ru-UA"/>
+        </w:rPr>
+      </w:pPr>
+      <w:r>
+        <w:lastRenderedPageBreak/>
+        <w:drawing>
+          <wp:inline distT="0" distB="0" distL="0" distR="0" wp14:anchorId="5B9E9B07" wp14:editId="34AAAD0A">
+            <wp:extent cx="6858000" cy="3674745"/>
+            <wp:effectExtent l="0" t="0" r="0" b="1905"/>
+            <wp:docPr id="13" name="Grafik 13"/>
+            <wp:cNvGraphicFramePr>
+              <a:graphicFrameLocks xmlns:a="http://schemas.openxmlformats.org/drawingml/2006/main" noChangeAspect="1"/>
+            </wp:cNvGraphicFramePr>
+            <a:graphic xmlns:a="http://schemas.openxmlformats.org/drawingml/2006/main">
+              <a:graphicData uri="http://schemas.openxmlformats.org/drawingml/2006/picture">
+                <pic:pic xmlns:pic="http://schemas.openxmlformats.org/drawingml/2006/picture">
+                  <pic:nvPicPr>
+                    <pic:cNvPr id="1" name=""/>
+                    <pic:cNvPicPr/>
+                  </pic:nvPicPr>
+                  <pic:blipFill>
+                    <a:blip r:embed="rId7"/>
+                    <a:stretch>
+                      <a:fillRect/>
+                    </a:stretch>
+                  </pic:blipFill>
+                  <pic:spPr>
+                    <a:xfrm>
+                      <a:off x="0" y="0"/>
                       <a:ext cx="6858000" cy="3674745"/>
                     </a:xfrm>
                     <a:prstGeom prst="rect">
@@ -155,6 +160,1690 @@
         </w:drawing>
       </w:r>
     </w:p>
+    <w:p>
+      <w:pPr>
+        <w:rPr>
+          <w:lang w:val="ru-UA"/>
+        </w:rPr>
+      </w:pPr>
+    </w:p>
+    <w:p>
+      <w:pPr>
+        <w:rPr>
+          <w:lang w:val="ru-UA"/>
+        </w:rPr>
+      </w:pPr>
+      <w:r>
+        <w:rPr>
+          <w:lang w:val="ru-UA"/>
+        </w:rPr>
+        <w:drawing>
+          <wp:inline distT="0" distB="0" distL="0" distR="0" wp14:anchorId="41328D48" wp14:editId="7B0FB1F1">
+            <wp:extent cx="6858000" cy="3153410"/>
+            <wp:effectExtent l="0" t="0" r="0" b="8890"/>
+            <wp:docPr id="14" name="Grafik 14"/>
+            <wp:cNvGraphicFramePr>
+              <a:graphicFrameLocks xmlns:a="http://schemas.openxmlformats.org/drawingml/2006/main" noChangeAspect="1"/>
+            </wp:cNvGraphicFramePr>
+            <a:graphic xmlns:a="http://schemas.openxmlformats.org/drawingml/2006/main">
+              <a:graphicData uri="http://schemas.openxmlformats.org/drawingml/2006/picture">
+                <pic:pic xmlns:pic="http://schemas.openxmlformats.org/drawingml/2006/picture">
+                  <pic:nvPicPr>
+                    <pic:cNvPr id="1" name=""/>
+                    <pic:cNvPicPr/>
+                  </pic:nvPicPr>
+                  <pic:blipFill>
+                    <a:blip r:embed="rId8"/>
+                    <a:stretch>
+                      <a:fillRect/>
+                    </a:stretch>
+                  </pic:blipFill>
+                  <pic:spPr>
+                    <a:xfrm>
+                      <a:off x="0" y="0"/>
+                      <a:ext cx="6858000" cy="3153410"/>
+                    </a:xfrm>
+                    <a:prstGeom prst="rect">
+                      <a:avLst/>
+                    </a:prstGeom>
+                  </pic:spPr>
+                </pic:pic>
+              </a:graphicData>
+            </a:graphic>
+          </wp:inline>
+        </w:drawing>
+      </w:r>
+    </w:p>
+    <w:p>
+      <w:pPr>
+        <w:rPr>
+          <w:lang w:val="ru-UA"/>
+        </w:rPr>
+      </w:pPr>
+    </w:p>
+    <w:p>
+      <w:pPr>
+        <w:rPr>
+          <w:lang w:val="ru-UA"/>
+        </w:rPr>
+      </w:pPr>
+    </w:p>
+    <w:p>
+      <w:pPr>
+        <w:spacing w:before="100" w:beforeAutospacing="1" w:after="100" w:afterAutospacing="1" w:line="240" w:lineRule="auto"/>
+        <w:rPr>
+          <w:rFonts w:ascii="Times New Roman" w:eastAsia="Times New Roman" w:hAnsi="Times New Roman" w:cs="Times New Roman"/>
+          <w:sz w:val="24"/>
+          <w:szCs w:val="24"/>
+        </w:rPr>
+      </w:pPr>
+      <w:proofErr w:type="spellStart"/>
+      <w:r>
+        <w:rPr>
+          <w:rFonts w:ascii="Source Sans Pro" w:hAnsi="Source Sans Pro"/>
+          <w:color w:val="F2F5FA"/>
+          <w:shd w:val="clear" w:color="auto" w:fill="000000"/>
+        </w:rPr>
+        <w:t>Список</w:t>
+      </w:r>
+      <w:proofErr w:type="spellEnd"/>
+      <w:r>
+        <w:rPr>
+          <w:rFonts w:ascii="Source Sans Pro" w:hAnsi="Source Sans Pro"/>
+          <w:color w:val="F2F5FA"/>
+          <w:shd w:val="clear" w:color="auto" w:fill="000000"/>
+        </w:rPr>
+        <w:t xml:space="preserve"> </w:t>
+      </w:r>
+      <w:proofErr w:type="spellStart"/>
+      <w:r>
+        <w:rPr>
+          <w:rFonts w:ascii="Source Sans Pro" w:hAnsi="Source Sans Pro"/>
+          <w:color w:val="F2F5FA"/>
+          <w:shd w:val="clear" w:color="auto" w:fill="000000"/>
+        </w:rPr>
+        <w:t>задач</w:t>
+      </w:r>
+      <w:proofErr w:type="spellEnd"/>
+      <w:r>
+        <w:rPr>
+          <w:rFonts w:ascii="Source Sans Pro" w:hAnsi="Source Sans Pro"/>
+          <w:color w:val="F2F5FA"/>
+          <w:shd w:val="clear" w:color="auto" w:fill="000000"/>
+        </w:rPr>
+        <w:t xml:space="preserve"> </w:t>
+      </w:r>
+      <w:proofErr w:type="spellStart"/>
+      <w:r>
+        <w:rPr>
+          <w:rFonts w:ascii="Source Sans Pro" w:hAnsi="Source Sans Pro"/>
+          <w:color w:val="F2F5FA"/>
+          <w:shd w:val="clear" w:color="auto" w:fill="000000"/>
+        </w:rPr>
+        <w:t>продукта</w:t>
+      </w:r>
+      <w:proofErr w:type="spellEnd"/>
+      <w:r>
+        <w:rPr>
+          <w:rFonts w:ascii="Times New Roman" w:eastAsia="Times New Roman" w:hAnsi="Times New Roman" w:cs="Times New Roman"/>
+          <w:sz w:val="24"/>
+          <w:szCs w:val="24"/>
+        </w:rPr>
+        <w:t>:</w:t>
+      </w:r>
+    </w:p>
+    <w:p>
+      <w:pPr>
+        <w:numPr>
+          <w:ilvl w:val="0"/>
+          <w:numId w:val="1"/>
+        </w:numPr>
+        <w:spacing w:before="100" w:beforeAutospacing="1" w:after="100" w:afterAutospacing="1" w:line="240" w:lineRule="auto"/>
+        <w:rPr>
+          <w:rFonts w:ascii="Times New Roman" w:eastAsia="Times New Roman" w:hAnsi="Times New Roman" w:cs="Times New Roman"/>
+          <w:sz w:val="24"/>
+          <w:szCs w:val="24"/>
+        </w:rPr>
+      </w:pPr>
+      <w:r>
+        <w:rPr>
+          <w:rFonts w:ascii="Courier New" w:eastAsia="Times New Roman" w:hAnsi="Courier New" w:cs="Courier New"/>
+          <w:sz w:val="20"/>
+          <w:szCs w:val="20"/>
+        </w:rPr>
+        <w:t>New Issues</w:t>
+      </w:r>
+      <w:r>
+        <w:rPr>
+          <w:rFonts w:ascii="Times New Roman" w:eastAsia="Times New Roman" w:hAnsi="Times New Roman" w:cs="Times New Roman"/>
+          <w:sz w:val="24"/>
+          <w:szCs w:val="24"/>
+        </w:rPr>
+        <w:t xml:space="preserve"> — </w:t>
+      </w:r>
+      <w:proofErr w:type="spellStart"/>
+      <w:r>
+        <w:rPr>
+          <w:rFonts w:ascii="Times New Roman" w:eastAsia="Times New Roman" w:hAnsi="Times New Roman" w:cs="Times New Roman"/>
+          <w:sz w:val="24"/>
+          <w:szCs w:val="24"/>
+        </w:rPr>
+        <w:t>новые</w:t>
+      </w:r>
+      <w:proofErr w:type="spellEnd"/>
+      <w:r>
+        <w:rPr>
+          <w:rFonts w:ascii="Times New Roman" w:eastAsia="Times New Roman" w:hAnsi="Times New Roman" w:cs="Times New Roman"/>
+          <w:sz w:val="24"/>
+          <w:szCs w:val="24"/>
+        </w:rPr>
+        <w:t xml:space="preserve"> </w:t>
+      </w:r>
+      <w:proofErr w:type="spellStart"/>
+      <w:r>
+        <w:rPr>
+          <w:rFonts w:ascii="Times New Roman" w:eastAsia="Times New Roman" w:hAnsi="Times New Roman" w:cs="Times New Roman"/>
+          <w:sz w:val="24"/>
+          <w:szCs w:val="24"/>
+        </w:rPr>
+        <w:t>проблемы</w:t>
+      </w:r>
+      <w:proofErr w:type="spellEnd"/>
+      <w:r>
+        <w:rPr>
+          <w:rFonts w:ascii="Times New Roman" w:eastAsia="Times New Roman" w:hAnsi="Times New Roman" w:cs="Times New Roman"/>
+          <w:sz w:val="24"/>
+          <w:szCs w:val="24"/>
+        </w:rPr>
+        <w:t>/</w:t>
+      </w:r>
+      <w:proofErr w:type="spellStart"/>
+      <w:r>
+        <w:rPr>
+          <w:rFonts w:ascii="Times New Roman" w:eastAsia="Times New Roman" w:hAnsi="Times New Roman" w:cs="Times New Roman"/>
+          <w:sz w:val="24"/>
+          <w:szCs w:val="24"/>
+        </w:rPr>
+        <w:t>задачи</w:t>
+      </w:r>
+      <w:proofErr w:type="spellEnd"/>
+      <w:r>
+        <w:rPr>
+          <w:rFonts w:ascii="Times New Roman" w:eastAsia="Times New Roman" w:hAnsi="Times New Roman" w:cs="Times New Roman"/>
+          <w:sz w:val="24"/>
+          <w:szCs w:val="24"/>
+        </w:rPr>
+        <w:t xml:space="preserve">, </w:t>
+      </w:r>
+      <w:proofErr w:type="spellStart"/>
+      <w:r>
+        <w:rPr>
+          <w:rFonts w:ascii="Times New Roman" w:eastAsia="Times New Roman" w:hAnsi="Times New Roman" w:cs="Times New Roman"/>
+          <w:sz w:val="24"/>
+          <w:szCs w:val="24"/>
+        </w:rPr>
+        <w:t>ещё</w:t>
+      </w:r>
+      <w:proofErr w:type="spellEnd"/>
+      <w:r>
+        <w:rPr>
+          <w:rFonts w:ascii="Times New Roman" w:eastAsia="Times New Roman" w:hAnsi="Times New Roman" w:cs="Times New Roman"/>
+          <w:sz w:val="24"/>
+          <w:szCs w:val="24"/>
+        </w:rPr>
+        <w:t xml:space="preserve"> </w:t>
+      </w:r>
+      <w:proofErr w:type="spellStart"/>
+      <w:r>
+        <w:rPr>
+          <w:rFonts w:ascii="Times New Roman" w:eastAsia="Times New Roman" w:hAnsi="Times New Roman" w:cs="Times New Roman"/>
+          <w:sz w:val="24"/>
+          <w:szCs w:val="24"/>
+        </w:rPr>
+        <w:t>не</w:t>
+      </w:r>
+      <w:proofErr w:type="spellEnd"/>
+      <w:r>
+        <w:rPr>
+          <w:rFonts w:ascii="Times New Roman" w:eastAsia="Times New Roman" w:hAnsi="Times New Roman" w:cs="Times New Roman"/>
+          <w:sz w:val="24"/>
+          <w:szCs w:val="24"/>
+        </w:rPr>
+        <w:t xml:space="preserve"> </w:t>
+      </w:r>
+      <w:proofErr w:type="spellStart"/>
+      <w:r>
+        <w:rPr>
+          <w:rFonts w:ascii="Times New Roman" w:eastAsia="Times New Roman" w:hAnsi="Times New Roman" w:cs="Times New Roman"/>
+          <w:sz w:val="24"/>
+          <w:szCs w:val="24"/>
+        </w:rPr>
+        <w:t>разобрали</w:t>
+      </w:r>
+      <w:proofErr w:type="spellEnd"/>
+      <w:r>
+        <w:rPr>
+          <w:rFonts w:ascii="Times New Roman" w:eastAsia="Times New Roman" w:hAnsi="Times New Roman" w:cs="Times New Roman"/>
+          <w:sz w:val="24"/>
+          <w:szCs w:val="24"/>
+        </w:rPr>
+        <w:t>;</w:t>
+      </w:r>
+    </w:p>
+    <w:p>
+      <w:pPr>
+        <w:numPr>
+          <w:ilvl w:val="0"/>
+          <w:numId w:val="1"/>
+        </w:numPr>
+        <w:spacing w:before="100" w:beforeAutospacing="1" w:after="100" w:afterAutospacing="1" w:line="240" w:lineRule="auto"/>
+        <w:rPr>
+          <w:rFonts w:ascii="Times New Roman" w:eastAsia="Times New Roman" w:hAnsi="Times New Roman" w:cs="Times New Roman"/>
+          <w:sz w:val="24"/>
+          <w:szCs w:val="24"/>
+        </w:rPr>
+      </w:pPr>
+      <w:r>
+        <w:rPr>
+          <w:rFonts w:ascii="Courier New" w:eastAsia="Times New Roman" w:hAnsi="Courier New" w:cs="Courier New"/>
+          <w:sz w:val="20"/>
+          <w:szCs w:val="20"/>
+        </w:rPr>
+        <w:t>Icebox</w:t>
+      </w:r>
+      <w:r>
+        <w:rPr>
+          <w:rFonts w:ascii="Times New Roman" w:eastAsia="Times New Roman" w:hAnsi="Times New Roman" w:cs="Times New Roman"/>
+          <w:sz w:val="24"/>
+          <w:szCs w:val="24"/>
+        </w:rPr>
+        <w:t xml:space="preserve"> — </w:t>
+      </w:r>
+      <w:proofErr w:type="spellStart"/>
+      <w:r>
+        <w:rPr>
+          <w:rFonts w:ascii="Times New Roman" w:eastAsia="Times New Roman" w:hAnsi="Times New Roman" w:cs="Times New Roman"/>
+          <w:b/>
+          <w:bCs/>
+          <w:sz w:val="24"/>
+          <w:szCs w:val="24"/>
+        </w:rPr>
+        <w:t>заморозили</w:t>
+      </w:r>
+      <w:proofErr w:type="spellEnd"/>
+      <w:r>
+        <w:rPr>
+          <w:rFonts w:ascii="Times New Roman" w:eastAsia="Times New Roman" w:hAnsi="Times New Roman" w:cs="Times New Roman"/>
+          <w:b/>
+          <w:bCs/>
+          <w:sz w:val="24"/>
+          <w:szCs w:val="24"/>
+        </w:rPr>
+        <w:t xml:space="preserve"> / </w:t>
+      </w:r>
+      <w:proofErr w:type="spellStart"/>
+      <w:r>
+        <w:rPr>
+          <w:rFonts w:ascii="Times New Roman" w:eastAsia="Times New Roman" w:hAnsi="Times New Roman" w:cs="Times New Roman"/>
+          <w:b/>
+          <w:bCs/>
+          <w:sz w:val="24"/>
+          <w:szCs w:val="24"/>
+        </w:rPr>
+        <w:t>отложили</w:t>
+      </w:r>
+      <w:proofErr w:type="spellEnd"/>
+      <w:r>
+        <w:rPr>
+          <w:rFonts w:ascii="Times New Roman" w:eastAsia="Times New Roman" w:hAnsi="Times New Roman" w:cs="Times New Roman"/>
+          <w:b/>
+          <w:bCs/>
+          <w:sz w:val="24"/>
+          <w:szCs w:val="24"/>
+        </w:rPr>
+        <w:t xml:space="preserve"> </w:t>
+      </w:r>
+      <w:proofErr w:type="spellStart"/>
+      <w:r>
+        <w:rPr>
+          <w:rFonts w:ascii="Times New Roman" w:eastAsia="Times New Roman" w:hAnsi="Times New Roman" w:cs="Times New Roman"/>
+          <w:b/>
+          <w:bCs/>
+          <w:sz w:val="24"/>
+          <w:szCs w:val="24"/>
+        </w:rPr>
+        <w:t>на</w:t>
+      </w:r>
+      <w:proofErr w:type="spellEnd"/>
+      <w:r>
+        <w:rPr>
+          <w:rFonts w:ascii="Times New Roman" w:eastAsia="Times New Roman" w:hAnsi="Times New Roman" w:cs="Times New Roman"/>
+          <w:b/>
+          <w:bCs/>
+          <w:sz w:val="24"/>
+          <w:szCs w:val="24"/>
+        </w:rPr>
+        <w:t xml:space="preserve"> </w:t>
+      </w:r>
+      <w:proofErr w:type="spellStart"/>
+      <w:r>
+        <w:rPr>
+          <w:rFonts w:ascii="Times New Roman" w:eastAsia="Times New Roman" w:hAnsi="Times New Roman" w:cs="Times New Roman"/>
+          <w:b/>
+          <w:bCs/>
+          <w:sz w:val="24"/>
+          <w:szCs w:val="24"/>
+        </w:rPr>
+        <w:t>потом</w:t>
+      </w:r>
+      <w:proofErr w:type="spellEnd"/>
+      <w:r>
+        <w:rPr>
+          <w:rFonts w:ascii="Times New Roman" w:eastAsia="Times New Roman" w:hAnsi="Times New Roman" w:cs="Times New Roman"/>
+          <w:sz w:val="24"/>
+          <w:szCs w:val="24"/>
+        </w:rPr>
+        <w:t>;</w:t>
+      </w:r>
+    </w:p>
+    <w:p>
+      <w:pPr>
+        <w:numPr>
+          <w:ilvl w:val="0"/>
+          <w:numId w:val="1"/>
+        </w:numPr>
+        <w:spacing w:before="100" w:beforeAutospacing="1" w:after="100" w:afterAutospacing="1" w:line="240" w:lineRule="auto"/>
+        <w:rPr>
+          <w:rFonts w:ascii="Times New Roman" w:eastAsia="Times New Roman" w:hAnsi="Times New Roman" w:cs="Times New Roman"/>
+          <w:sz w:val="24"/>
+          <w:szCs w:val="24"/>
+        </w:rPr>
+      </w:pPr>
+      <w:r>
+        <w:rPr>
+          <w:rFonts w:ascii="Courier New" w:eastAsia="Times New Roman" w:hAnsi="Courier New" w:cs="Courier New"/>
+          <w:sz w:val="20"/>
+          <w:szCs w:val="20"/>
+        </w:rPr>
+        <w:t>Product Backlog</w:t>
+      </w:r>
+      <w:r>
+        <w:rPr>
+          <w:rFonts w:ascii="Times New Roman" w:eastAsia="Times New Roman" w:hAnsi="Times New Roman" w:cs="Times New Roman"/>
+          <w:sz w:val="24"/>
+          <w:szCs w:val="24"/>
+        </w:rPr>
+        <w:t xml:space="preserve"> — </w:t>
+      </w:r>
+      <w:proofErr w:type="spellStart"/>
+      <w:r>
+        <w:rPr>
+          <w:rFonts w:ascii="Times New Roman" w:eastAsia="Times New Roman" w:hAnsi="Times New Roman" w:cs="Times New Roman"/>
+          <w:sz w:val="24"/>
+          <w:szCs w:val="24"/>
+        </w:rPr>
+        <w:t>задача</w:t>
+      </w:r>
+      <w:proofErr w:type="spellEnd"/>
+      <w:r>
+        <w:rPr>
+          <w:rFonts w:ascii="Times New Roman" w:eastAsia="Times New Roman" w:hAnsi="Times New Roman" w:cs="Times New Roman"/>
+          <w:sz w:val="24"/>
+          <w:szCs w:val="24"/>
+        </w:rPr>
+        <w:t xml:space="preserve"> </w:t>
+      </w:r>
+      <w:proofErr w:type="spellStart"/>
+      <w:r>
+        <w:rPr>
+          <w:rFonts w:ascii="Times New Roman" w:eastAsia="Times New Roman" w:hAnsi="Times New Roman" w:cs="Times New Roman"/>
+          <w:b/>
+          <w:bCs/>
+          <w:sz w:val="24"/>
+          <w:szCs w:val="24"/>
+        </w:rPr>
+        <w:t>нужна</w:t>
+      </w:r>
+      <w:proofErr w:type="spellEnd"/>
+      <w:r>
+        <w:rPr>
+          <w:rFonts w:ascii="Times New Roman" w:eastAsia="Times New Roman" w:hAnsi="Times New Roman" w:cs="Times New Roman"/>
+          <w:b/>
+          <w:bCs/>
+          <w:sz w:val="24"/>
+          <w:szCs w:val="24"/>
+        </w:rPr>
+        <w:t xml:space="preserve"> и </w:t>
+      </w:r>
+      <w:proofErr w:type="spellStart"/>
+      <w:r>
+        <w:rPr>
+          <w:rFonts w:ascii="Times New Roman" w:eastAsia="Times New Roman" w:hAnsi="Times New Roman" w:cs="Times New Roman"/>
+          <w:b/>
+          <w:bCs/>
+          <w:sz w:val="24"/>
+          <w:szCs w:val="24"/>
+        </w:rPr>
+        <w:t>стоит</w:t>
+      </w:r>
+      <w:proofErr w:type="spellEnd"/>
+      <w:r>
+        <w:rPr>
+          <w:rFonts w:ascii="Times New Roman" w:eastAsia="Times New Roman" w:hAnsi="Times New Roman" w:cs="Times New Roman"/>
+          <w:b/>
+          <w:bCs/>
+          <w:sz w:val="24"/>
+          <w:szCs w:val="24"/>
+        </w:rPr>
+        <w:t xml:space="preserve"> в </w:t>
+      </w:r>
+      <w:proofErr w:type="spellStart"/>
+      <w:r>
+        <w:rPr>
+          <w:rFonts w:ascii="Times New Roman" w:eastAsia="Times New Roman" w:hAnsi="Times New Roman" w:cs="Times New Roman"/>
+          <w:b/>
+          <w:bCs/>
+          <w:sz w:val="24"/>
+          <w:szCs w:val="24"/>
+        </w:rPr>
+        <w:t>очереди</w:t>
+      </w:r>
+      <w:proofErr w:type="spellEnd"/>
+      <w:r>
+        <w:rPr>
+          <w:rFonts w:ascii="Times New Roman" w:eastAsia="Times New Roman" w:hAnsi="Times New Roman" w:cs="Times New Roman"/>
+          <w:b/>
+          <w:bCs/>
+          <w:sz w:val="24"/>
+          <w:szCs w:val="24"/>
+        </w:rPr>
+        <w:t xml:space="preserve"> </w:t>
+      </w:r>
+      <w:proofErr w:type="spellStart"/>
+      <w:r>
+        <w:rPr>
+          <w:rFonts w:ascii="Times New Roman" w:eastAsia="Times New Roman" w:hAnsi="Times New Roman" w:cs="Times New Roman"/>
+          <w:b/>
+          <w:bCs/>
+          <w:sz w:val="24"/>
+          <w:szCs w:val="24"/>
+        </w:rPr>
+        <w:t>на</w:t>
+      </w:r>
+      <w:proofErr w:type="spellEnd"/>
+      <w:r>
+        <w:rPr>
+          <w:rFonts w:ascii="Times New Roman" w:eastAsia="Times New Roman" w:hAnsi="Times New Roman" w:cs="Times New Roman"/>
+          <w:b/>
+          <w:bCs/>
+          <w:sz w:val="24"/>
+          <w:szCs w:val="24"/>
+        </w:rPr>
+        <w:t xml:space="preserve"> </w:t>
+      </w:r>
+      <w:proofErr w:type="spellStart"/>
+      <w:r>
+        <w:rPr>
+          <w:rFonts w:ascii="Times New Roman" w:eastAsia="Times New Roman" w:hAnsi="Times New Roman" w:cs="Times New Roman"/>
+          <w:b/>
+          <w:bCs/>
+          <w:sz w:val="24"/>
+          <w:szCs w:val="24"/>
+        </w:rPr>
+        <w:t>реализацию</w:t>
+      </w:r>
+      <w:proofErr w:type="spellEnd"/>
+      <w:r>
+        <w:rPr>
+          <w:rFonts w:ascii="Times New Roman" w:eastAsia="Times New Roman" w:hAnsi="Times New Roman" w:cs="Times New Roman"/>
+          <w:sz w:val="24"/>
+          <w:szCs w:val="24"/>
+        </w:rPr>
+        <w:t>;</w:t>
+      </w:r>
+    </w:p>
+    <w:p>
+      <w:pPr>
+        <w:numPr>
+          <w:ilvl w:val="0"/>
+          <w:numId w:val="1"/>
+        </w:numPr>
+        <w:spacing w:before="100" w:beforeAutospacing="1" w:after="100" w:afterAutospacing="1" w:line="240" w:lineRule="auto"/>
+        <w:rPr>
+          <w:rFonts w:ascii="Times New Roman" w:eastAsia="Times New Roman" w:hAnsi="Times New Roman" w:cs="Times New Roman"/>
+          <w:sz w:val="24"/>
+          <w:szCs w:val="24"/>
+        </w:rPr>
+      </w:pPr>
+      <w:r>
+        <w:rPr>
+          <w:rFonts w:ascii="Courier New" w:eastAsia="Times New Roman" w:hAnsi="Courier New" w:cs="Courier New"/>
+          <w:sz w:val="20"/>
+          <w:szCs w:val="20"/>
+        </w:rPr>
+        <w:t>Sprint Backlog</w:t>
+      </w:r>
+      <w:r>
+        <w:rPr>
+          <w:rFonts w:ascii="Times New Roman" w:eastAsia="Times New Roman" w:hAnsi="Times New Roman" w:cs="Times New Roman"/>
+          <w:sz w:val="24"/>
+          <w:szCs w:val="24"/>
+        </w:rPr>
+        <w:t xml:space="preserve"> — </w:t>
+      </w:r>
+      <w:proofErr w:type="spellStart"/>
+      <w:r>
+        <w:rPr>
+          <w:rFonts w:ascii="Times New Roman" w:eastAsia="Times New Roman" w:hAnsi="Times New Roman" w:cs="Times New Roman"/>
+          <w:sz w:val="24"/>
+          <w:szCs w:val="24"/>
+        </w:rPr>
+        <w:t>уже</w:t>
+      </w:r>
+      <w:proofErr w:type="spellEnd"/>
+      <w:r>
+        <w:rPr>
+          <w:rFonts w:ascii="Times New Roman" w:eastAsia="Times New Roman" w:hAnsi="Times New Roman" w:cs="Times New Roman"/>
+          <w:sz w:val="24"/>
+          <w:szCs w:val="24"/>
+        </w:rPr>
+        <w:t xml:space="preserve"> </w:t>
+      </w:r>
+      <w:proofErr w:type="spellStart"/>
+      <w:r>
+        <w:rPr>
+          <w:rFonts w:ascii="Times New Roman" w:eastAsia="Times New Roman" w:hAnsi="Times New Roman" w:cs="Times New Roman"/>
+          <w:b/>
+          <w:bCs/>
+          <w:sz w:val="24"/>
+          <w:szCs w:val="24"/>
+        </w:rPr>
+        <w:t>взяли</w:t>
+      </w:r>
+      <w:proofErr w:type="spellEnd"/>
+      <w:r>
+        <w:rPr>
+          <w:rFonts w:ascii="Times New Roman" w:eastAsia="Times New Roman" w:hAnsi="Times New Roman" w:cs="Times New Roman"/>
+          <w:b/>
+          <w:bCs/>
+          <w:sz w:val="24"/>
+          <w:szCs w:val="24"/>
+        </w:rPr>
+        <w:t xml:space="preserve"> в </w:t>
+      </w:r>
+      <w:proofErr w:type="spellStart"/>
+      <w:r>
+        <w:rPr>
+          <w:rFonts w:ascii="Times New Roman" w:eastAsia="Times New Roman" w:hAnsi="Times New Roman" w:cs="Times New Roman"/>
+          <w:b/>
+          <w:bCs/>
+          <w:sz w:val="24"/>
+          <w:szCs w:val="24"/>
+        </w:rPr>
+        <w:t>текущую</w:t>
+      </w:r>
+      <w:proofErr w:type="spellEnd"/>
+      <w:r>
+        <w:rPr>
+          <w:rFonts w:ascii="Times New Roman" w:eastAsia="Times New Roman" w:hAnsi="Times New Roman" w:cs="Times New Roman"/>
+          <w:b/>
+          <w:bCs/>
+          <w:sz w:val="24"/>
+          <w:szCs w:val="24"/>
+        </w:rPr>
+        <w:t xml:space="preserve"> </w:t>
+      </w:r>
+      <w:proofErr w:type="spellStart"/>
+      <w:r>
+        <w:rPr>
+          <w:rFonts w:ascii="Times New Roman" w:eastAsia="Times New Roman" w:hAnsi="Times New Roman" w:cs="Times New Roman"/>
+          <w:b/>
+          <w:bCs/>
+          <w:sz w:val="24"/>
+          <w:szCs w:val="24"/>
+        </w:rPr>
+        <w:t>итерацию</w:t>
+      </w:r>
+      <w:proofErr w:type="spellEnd"/>
+      <w:r>
+        <w:rPr>
+          <w:rFonts w:ascii="Times New Roman" w:eastAsia="Times New Roman" w:hAnsi="Times New Roman" w:cs="Times New Roman"/>
+          <w:b/>
+          <w:bCs/>
+          <w:sz w:val="24"/>
+          <w:szCs w:val="24"/>
+        </w:rPr>
+        <w:t>/</w:t>
+      </w:r>
+      <w:proofErr w:type="spellStart"/>
+      <w:r>
+        <w:rPr>
+          <w:rFonts w:ascii="Times New Roman" w:eastAsia="Times New Roman" w:hAnsi="Times New Roman" w:cs="Times New Roman"/>
+          <w:b/>
+          <w:bCs/>
+          <w:sz w:val="24"/>
+          <w:szCs w:val="24"/>
+        </w:rPr>
+        <w:t>спринт</w:t>
+      </w:r>
+      <w:proofErr w:type="spellEnd"/>
+      <w:r>
+        <w:rPr>
+          <w:rFonts w:ascii="Times New Roman" w:eastAsia="Times New Roman" w:hAnsi="Times New Roman" w:cs="Times New Roman"/>
+          <w:sz w:val="24"/>
+          <w:szCs w:val="24"/>
+        </w:rPr>
+        <w:t>;</w:t>
+      </w:r>
+    </w:p>
+    <w:p>
+      <w:pPr>
+        <w:numPr>
+          <w:ilvl w:val="0"/>
+          <w:numId w:val="1"/>
+        </w:numPr>
+        <w:spacing w:before="100" w:beforeAutospacing="1" w:after="100" w:afterAutospacing="1" w:line="240" w:lineRule="auto"/>
+        <w:rPr>
+          <w:rFonts w:ascii="Times New Roman" w:eastAsia="Times New Roman" w:hAnsi="Times New Roman" w:cs="Times New Roman"/>
+          <w:sz w:val="24"/>
+          <w:szCs w:val="24"/>
+        </w:rPr>
+      </w:pPr>
+      <w:r>
+        <w:rPr>
+          <w:rFonts w:ascii="Courier New" w:eastAsia="Times New Roman" w:hAnsi="Courier New" w:cs="Courier New"/>
+          <w:sz w:val="20"/>
+          <w:szCs w:val="20"/>
+        </w:rPr>
+        <w:lastRenderedPageBreak/>
+        <w:t>In Progress</w:t>
+      </w:r>
+      <w:r>
+        <w:rPr>
+          <w:rFonts w:ascii="Times New Roman" w:eastAsia="Times New Roman" w:hAnsi="Times New Roman" w:cs="Times New Roman"/>
+          <w:sz w:val="24"/>
+          <w:szCs w:val="24"/>
+        </w:rPr>
+        <w:t xml:space="preserve"> — </w:t>
+      </w:r>
+      <w:proofErr w:type="spellStart"/>
+      <w:r>
+        <w:rPr>
+          <w:rFonts w:ascii="Times New Roman" w:eastAsia="Times New Roman" w:hAnsi="Times New Roman" w:cs="Times New Roman"/>
+          <w:b/>
+          <w:bCs/>
+          <w:sz w:val="24"/>
+          <w:szCs w:val="24"/>
+        </w:rPr>
+        <w:t>прямо</w:t>
+      </w:r>
+      <w:proofErr w:type="spellEnd"/>
+      <w:r>
+        <w:rPr>
+          <w:rFonts w:ascii="Times New Roman" w:eastAsia="Times New Roman" w:hAnsi="Times New Roman" w:cs="Times New Roman"/>
+          <w:b/>
+          <w:bCs/>
+          <w:sz w:val="24"/>
+          <w:szCs w:val="24"/>
+        </w:rPr>
+        <w:t xml:space="preserve"> </w:t>
+      </w:r>
+      <w:proofErr w:type="spellStart"/>
+      <w:r>
+        <w:rPr>
+          <w:rFonts w:ascii="Times New Roman" w:eastAsia="Times New Roman" w:hAnsi="Times New Roman" w:cs="Times New Roman"/>
+          <w:b/>
+          <w:bCs/>
+          <w:sz w:val="24"/>
+          <w:szCs w:val="24"/>
+        </w:rPr>
+        <w:t>сейчас</w:t>
+      </w:r>
+      <w:proofErr w:type="spellEnd"/>
+      <w:r>
+        <w:rPr>
+          <w:rFonts w:ascii="Times New Roman" w:eastAsia="Times New Roman" w:hAnsi="Times New Roman" w:cs="Times New Roman"/>
+          <w:b/>
+          <w:bCs/>
+          <w:sz w:val="24"/>
+          <w:szCs w:val="24"/>
+        </w:rPr>
+        <w:t xml:space="preserve"> в </w:t>
+      </w:r>
+      <w:proofErr w:type="spellStart"/>
+      <w:r>
+        <w:rPr>
+          <w:rFonts w:ascii="Times New Roman" w:eastAsia="Times New Roman" w:hAnsi="Times New Roman" w:cs="Times New Roman"/>
+          <w:b/>
+          <w:bCs/>
+          <w:sz w:val="24"/>
+          <w:szCs w:val="24"/>
+        </w:rPr>
+        <w:t>работе</w:t>
+      </w:r>
+      <w:proofErr w:type="spellEnd"/>
+      <w:r>
+        <w:rPr>
+          <w:rFonts w:ascii="Times New Roman" w:eastAsia="Times New Roman" w:hAnsi="Times New Roman" w:cs="Times New Roman"/>
+          <w:sz w:val="24"/>
+          <w:szCs w:val="24"/>
+        </w:rPr>
+        <w:t>;</w:t>
+      </w:r>
+    </w:p>
+    <w:p>
+      <w:pPr>
+        <w:numPr>
+          <w:ilvl w:val="0"/>
+          <w:numId w:val="1"/>
+        </w:numPr>
+        <w:spacing w:before="100" w:beforeAutospacing="1" w:after="100" w:afterAutospacing="1" w:line="240" w:lineRule="auto"/>
+        <w:rPr>
+          <w:rFonts w:ascii="Times New Roman" w:eastAsia="Times New Roman" w:hAnsi="Times New Roman" w:cs="Times New Roman"/>
+          <w:sz w:val="24"/>
+          <w:szCs w:val="24"/>
+        </w:rPr>
+      </w:pPr>
+      <w:r>
+        <w:rPr>
+          <w:rFonts w:ascii="Courier New" w:eastAsia="Times New Roman" w:hAnsi="Courier New" w:cs="Courier New"/>
+          <w:sz w:val="20"/>
+          <w:szCs w:val="20"/>
+        </w:rPr>
+        <w:t>Review/QA</w:t>
+      </w:r>
+      <w:r>
+        <w:rPr>
+          <w:rFonts w:ascii="Times New Roman" w:eastAsia="Times New Roman" w:hAnsi="Times New Roman" w:cs="Times New Roman"/>
+          <w:sz w:val="24"/>
+          <w:szCs w:val="24"/>
+        </w:rPr>
+        <w:t xml:space="preserve"> — </w:t>
+      </w:r>
+      <w:proofErr w:type="spellStart"/>
+      <w:r>
+        <w:rPr>
+          <w:rFonts w:ascii="Times New Roman" w:eastAsia="Times New Roman" w:hAnsi="Times New Roman" w:cs="Times New Roman"/>
+          <w:sz w:val="24"/>
+          <w:szCs w:val="24"/>
+        </w:rPr>
+        <w:t>уже</w:t>
+      </w:r>
+      <w:proofErr w:type="spellEnd"/>
+      <w:r>
+        <w:rPr>
+          <w:rFonts w:ascii="Times New Roman" w:eastAsia="Times New Roman" w:hAnsi="Times New Roman" w:cs="Times New Roman"/>
+          <w:sz w:val="24"/>
+          <w:szCs w:val="24"/>
+        </w:rPr>
+        <w:t xml:space="preserve"> </w:t>
+      </w:r>
+      <w:proofErr w:type="spellStart"/>
+      <w:r>
+        <w:rPr>
+          <w:rFonts w:ascii="Times New Roman" w:eastAsia="Times New Roman" w:hAnsi="Times New Roman" w:cs="Times New Roman"/>
+          <w:sz w:val="24"/>
+          <w:szCs w:val="24"/>
+        </w:rPr>
+        <w:t>сделали</w:t>
+      </w:r>
+      <w:proofErr w:type="spellEnd"/>
+      <w:r>
+        <w:rPr>
+          <w:rFonts w:ascii="Times New Roman" w:eastAsia="Times New Roman" w:hAnsi="Times New Roman" w:cs="Times New Roman"/>
+          <w:sz w:val="24"/>
+          <w:szCs w:val="24"/>
+        </w:rPr>
+        <w:t xml:space="preserve">, </w:t>
+      </w:r>
+      <w:proofErr w:type="spellStart"/>
+      <w:r>
+        <w:rPr>
+          <w:rFonts w:ascii="Times New Roman" w:eastAsia="Times New Roman" w:hAnsi="Times New Roman" w:cs="Times New Roman"/>
+          <w:sz w:val="24"/>
+          <w:szCs w:val="24"/>
+        </w:rPr>
+        <w:t>теперь</w:t>
+      </w:r>
+      <w:proofErr w:type="spellEnd"/>
+      <w:r>
+        <w:rPr>
+          <w:rFonts w:ascii="Times New Roman" w:eastAsia="Times New Roman" w:hAnsi="Times New Roman" w:cs="Times New Roman"/>
+          <w:sz w:val="24"/>
+          <w:szCs w:val="24"/>
+        </w:rPr>
+        <w:t xml:space="preserve"> </w:t>
+      </w:r>
+      <w:proofErr w:type="spellStart"/>
+      <w:r>
+        <w:rPr>
+          <w:rFonts w:ascii="Times New Roman" w:eastAsia="Times New Roman" w:hAnsi="Times New Roman" w:cs="Times New Roman"/>
+          <w:sz w:val="24"/>
+          <w:szCs w:val="24"/>
+        </w:rPr>
+        <w:t>проверяем</w:t>
+      </w:r>
+      <w:proofErr w:type="spellEnd"/>
+      <w:r>
+        <w:rPr>
+          <w:rFonts w:ascii="Times New Roman" w:eastAsia="Times New Roman" w:hAnsi="Times New Roman" w:cs="Times New Roman"/>
+          <w:sz w:val="24"/>
+          <w:szCs w:val="24"/>
+        </w:rPr>
+        <w:t>;</w:t>
+      </w:r>
+    </w:p>
+    <w:p>
+      <w:pPr>
+        <w:numPr>
+          <w:ilvl w:val="0"/>
+          <w:numId w:val="1"/>
+        </w:numPr>
+        <w:spacing w:before="100" w:beforeAutospacing="1" w:after="100" w:afterAutospacing="1" w:line="240" w:lineRule="auto"/>
+        <w:rPr>
+          <w:rFonts w:ascii="Times New Roman" w:eastAsia="Times New Roman" w:hAnsi="Times New Roman" w:cs="Times New Roman"/>
+          <w:sz w:val="24"/>
+          <w:szCs w:val="24"/>
+        </w:rPr>
+      </w:pPr>
+      <w:r>
+        <w:rPr>
+          <w:rFonts w:ascii="Courier New" w:eastAsia="Times New Roman" w:hAnsi="Courier New" w:cs="Courier New"/>
+          <w:sz w:val="20"/>
+          <w:szCs w:val="20"/>
+        </w:rPr>
+        <w:t>Done</w:t>
+      </w:r>
+      <w:r>
+        <w:rPr>
+          <w:rFonts w:ascii="Times New Roman" w:eastAsia="Times New Roman" w:hAnsi="Times New Roman" w:cs="Times New Roman"/>
+          <w:sz w:val="24"/>
+          <w:szCs w:val="24"/>
+        </w:rPr>
+        <w:t xml:space="preserve"> — </w:t>
+      </w:r>
+      <w:proofErr w:type="spellStart"/>
+      <w:r>
+        <w:rPr>
+          <w:rFonts w:ascii="Times New Roman" w:eastAsia="Times New Roman" w:hAnsi="Times New Roman" w:cs="Times New Roman"/>
+          <w:sz w:val="24"/>
+          <w:szCs w:val="24"/>
+        </w:rPr>
+        <w:t>полностью</w:t>
+      </w:r>
+      <w:proofErr w:type="spellEnd"/>
+      <w:r>
+        <w:rPr>
+          <w:rFonts w:ascii="Times New Roman" w:eastAsia="Times New Roman" w:hAnsi="Times New Roman" w:cs="Times New Roman"/>
+          <w:sz w:val="24"/>
+          <w:szCs w:val="24"/>
+        </w:rPr>
+        <w:t xml:space="preserve"> </w:t>
+      </w:r>
+      <w:proofErr w:type="spellStart"/>
+      <w:r>
+        <w:rPr>
+          <w:rFonts w:ascii="Times New Roman" w:eastAsia="Times New Roman" w:hAnsi="Times New Roman" w:cs="Times New Roman"/>
+          <w:sz w:val="24"/>
+          <w:szCs w:val="24"/>
+        </w:rPr>
+        <w:t>завершено</w:t>
+      </w:r>
+      <w:proofErr w:type="spellEnd"/>
+      <w:r>
+        <w:rPr>
+          <w:rFonts w:ascii="Times New Roman" w:eastAsia="Times New Roman" w:hAnsi="Times New Roman" w:cs="Times New Roman"/>
+          <w:sz w:val="24"/>
+          <w:szCs w:val="24"/>
+        </w:rPr>
+        <w:t>.</w:t>
+      </w:r>
+    </w:p>
+    <w:p>
+      <w:pPr>
+        <w:pStyle w:val="StandardWeb"/>
+        <w:numPr>
+          <w:ilvl w:val="0"/>
+          <w:numId w:val="1"/>
+        </w:numPr>
+        <w:shd w:val="clear" w:color="auto" w:fill="000000"/>
+        <w:spacing w:before="120" w:beforeAutospacing="0" w:after="0" w:afterAutospacing="0" w:line="360" w:lineRule="atLeast"/>
+        <w:rPr>
+          <w:rFonts w:ascii="Source Sans Pro" w:hAnsi="Source Sans Pro"/>
+          <w:color w:val="F2F5FA"/>
+        </w:rPr>
+      </w:pPr>
+      <w:proofErr w:type="spellStart"/>
+      <w:r>
+        <w:rPr>
+          <w:rFonts w:ascii="Source Sans Pro" w:hAnsi="Source Sans Pro"/>
+          <w:color w:val="F2F5FA"/>
+        </w:rPr>
+        <w:t>Список</w:t>
+      </w:r>
+      <w:proofErr w:type="spellEnd"/>
+      <w:r>
+        <w:rPr>
+          <w:rFonts w:ascii="Source Sans Pro" w:hAnsi="Source Sans Pro"/>
+          <w:color w:val="F2F5FA"/>
+        </w:rPr>
+        <w:t xml:space="preserve"> </w:t>
+      </w:r>
+      <w:proofErr w:type="spellStart"/>
+      <w:r>
+        <w:rPr>
+          <w:rFonts w:ascii="Source Sans Pro" w:hAnsi="Source Sans Pro"/>
+          <w:color w:val="F2F5FA"/>
+        </w:rPr>
+        <w:t>задач</w:t>
+      </w:r>
+      <w:proofErr w:type="spellEnd"/>
+      <w:r>
+        <w:rPr>
+          <w:rFonts w:ascii="Source Sans Pro" w:hAnsi="Source Sans Pro"/>
+          <w:color w:val="F2F5FA"/>
+        </w:rPr>
+        <w:t xml:space="preserve"> </w:t>
+      </w:r>
+      <w:proofErr w:type="spellStart"/>
+      <w:r>
+        <w:rPr>
+          <w:rFonts w:ascii="Source Sans Pro" w:hAnsi="Source Sans Pro"/>
+          <w:color w:val="F2F5FA"/>
+        </w:rPr>
+        <w:t>продукта</w:t>
+      </w:r>
+      <w:proofErr w:type="spellEnd"/>
+      <w:r>
+        <w:rPr>
+          <w:rFonts w:ascii="Source Sans Pro" w:hAnsi="Source Sans Pro"/>
+          <w:color w:val="F2F5FA"/>
+        </w:rPr>
+        <w:t xml:space="preserve"> — </w:t>
+      </w:r>
+      <w:proofErr w:type="spellStart"/>
+      <w:r>
+        <w:rPr>
+          <w:rFonts w:ascii="Source Sans Pro" w:hAnsi="Source Sans Pro"/>
+          <w:color w:val="F2F5FA"/>
+        </w:rPr>
+        <w:t>это</w:t>
+      </w:r>
+      <w:proofErr w:type="spellEnd"/>
+      <w:r>
+        <w:rPr>
+          <w:rFonts w:ascii="Source Sans Pro" w:hAnsi="Source Sans Pro"/>
+          <w:color w:val="F2F5FA"/>
+        </w:rPr>
+        <w:t xml:space="preserve"> </w:t>
+      </w:r>
+      <w:proofErr w:type="spellStart"/>
+      <w:r>
+        <w:rPr>
+          <w:rFonts w:ascii="Source Sans Pro" w:hAnsi="Source Sans Pro"/>
+          <w:color w:val="F2F5FA"/>
+        </w:rPr>
+        <w:t>ранжированный</w:t>
+      </w:r>
+      <w:proofErr w:type="spellEnd"/>
+      <w:r>
+        <w:rPr>
+          <w:rFonts w:ascii="Source Sans Pro" w:hAnsi="Source Sans Pro"/>
+          <w:color w:val="F2F5FA"/>
+        </w:rPr>
+        <w:t xml:space="preserve"> </w:t>
+      </w:r>
+      <w:proofErr w:type="spellStart"/>
+      <w:r>
+        <w:rPr>
+          <w:rFonts w:ascii="Source Sans Pro" w:hAnsi="Source Sans Pro"/>
+          <w:color w:val="F2F5FA"/>
+        </w:rPr>
+        <w:t>перечень</w:t>
+      </w:r>
+      <w:proofErr w:type="spellEnd"/>
+      <w:r>
+        <w:rPr>
+          <w:rFonts w:ascii="Source Sans Pro" w:hAnsi="Source Sans Pro"/>
+          <w:color w:val="F2F5FA"/>
+        </w:rPr>
+        <w:t xml:space="preserve"> </w:t>
+      </w:r>
+      <w:proofErr w:type="spellStart"/>
+      <w:r>
+        <w:rPr>
+          <w:rFonts w:ascii="Source Sans Pro" w:hAnsi="Source Sans Pro"/>
+          <w:color w:val="F2F5FA"/>
+        </w:rPr>
+        <w:t>всех</w:t>
+      </w:r>
+      <w:proofErr w:type="spellEnd"/>
+      <w:r>
+        <w:rPr>
+          <w:rFonts w:ascii="Source Sans Pro" w:hAnsi="Source Sans Pro"/>
+          <w:color w:val="F2F5FA"/>
+        </w:rPr>
+        <w:t xml:space="preserve"> </w:t>
+      </w:r>
+      <w:proofErr w:type="spellStart"/>
+      <w:r>
+        <w:rPr>
+          <w:rFonts w:ascii="Source Sans Pro" w:hAnsi="Source Sans Pro"/>
+          <w:color w:val="F2F5FA"/>
+        </w:rPr>
+        <w:t>нереализованных</w:t>
+      </w:r>
+      <w:proofErr w:type="spellEnd"/>
+      <w:r>
+        <w:rPr>
+          <w:rFonts w:ascii="Source Sans Pro" w:hAnsi="Source Sans Pro"/>
+          <w:color w:val="F2F5FA"/>
+        </w:rPr>
+        <w:t xml:space="preserve"> </w:t>
+      </w:r>
+      <w:proofErr w:type="spellStart"/>
+      <w:r>
+        <w:rPr>
+          <w:rFonts w:ascii="Source Sans Pro" w:hAnsi="Source Sans Pro"/>
+          <w:color w:val="F2F5FA"/>
+        </w:rPr>
+        <w:t>историй</w:t>
+      </w:r>
+      <w:proofErr w:type="spellEnd"/>
+      <w:r>
+        <w:rPr>
+          <w:rFonts w:ascii="Source Sans Pro" w:hAnsi="Source Sans Pro"/>
+          <w:color w:val="F2F5FA"/>
+        </w:rPr>
+        <w:t>. </w:t>
+      </w:r>
+    </w:p>
+    <w:p/>
+    <w:p>
+      <w:pPr>
+        <w:rPr>
+          <w:lang w:val="ru-UA"/>
+        </w:rPr>
+      </w:pPr>
+      <w:r>
+        <w:drawing>
+          <wp:inline distT="0" distB="0" distL="0" distR="0" wp14:anchorId="4D43687C" wp14:editId="2E0C431A">
+            <wp:extent cx="6354062" cy="4334480"/>
+            <wp:effectExtent l="0" t="0" r="8890" b="9525"/>
+            <wp:docPr id="16" name="Grafik 16"/>
+            <wp:cNvGraphicFramePr>
+              <a:graphicFrameLocks xmlns:a="http://schemas.openxmlformats.org/drawingml/2006/main" noChangeAspect="1"/>
+            </wp:cNvGraphicFramePr>
+            <a:graphic xmlns:a="http://schemas.openxmlformats.org/drawingml/2006/main">
+              <a:graphicData uri="http://schemas.openxmlformats.org/drawingml/2006/picture">
+                <pic:pic xmlns:pic="http://schemas.openxmlformats.org/drawingml/2006/picture">
+                  <pic:nvPicPr>
+                    <pic:cNvPr id="1" name=""/>
+                    <pic:cNvPicPr/>
+                  </pic:nvPicPr>
+                  <pic:blipFill>
+                    <a:blip r:embed="rId9"/>
+                    <a:stretch>
+                      <a:fillRect/>
+                    </a:stretch>
+                  </pic:blipFill>
+                  <pic:spPr>
+                    <a:xfrm>
+                      <a:off x="0" y="0"/>
+                      <a:ext cx="6354062" cy="4334480"/>
+                    </a:xfrm>
+                    <a:prstGeom prst="rect">
+                      <a:avLst/>
+                    </a:prstGeom>
+                  </pic:spPr>
+                </pic:pic>
+              </a:graphicData>
+            </a:graphic>
+          </wp:inline>
+        </w:drawing>
+      </w:r>
+    </w:p>
+    <w:p>
+      <w:pPr>
+        <w:rPr>
+          <w:lang w:val="ru-UA"/>
+        </w:rPr>
+      </w:pPr>
+    </w:p>
+    <w:p>
+      <w:pPr>
+        <w:spacing w:before="100" w:beforeAutospacing="1" w:after="100" w:afterAutospacing="1" w:line="240" w:lineRule="auto"/>
+        <w:rPr>
+          <w:rFonts w:ascii="Times New Roman" w:eastAsia="Times New Roman" w:hAnsi="Times New Roman" w:cs="Times New Roman"/>
+          <w:sz w:val="24"/>
+          <w:szCs w:val="24"/>
+          <w:lang w:val="ru-UA"/>
+        </w:rPr>
+      </w:pPr>
+      <w:r>
+        <w:rPr>
+          <w:rFonts w:ascii="Times New Roman" w:eastAsia="Times New Roman" w:hAnsi="Times New Roman" w:cs="Times New Roman"/>
+          <w:sz w:val="24"/>
+          <w:szCs w:val="24"/>
+          <w:lang w:val="ru-UA"/>
+        </w:rPr>
+        <w:t>электронная доска даёт больше контроля:</w:t>
+      </w:r>
+    </w:p>
+    <w:p>
+      <w:pPr>
+        <w:numPr>
+          <w:ilvl w:val="0"/>
+          <w:numId w:val="3"/>
+        </w:numPr>
+        <w:spacing w:before="100" w:beforeAutospacing="1" w:after="100" w:afterAutospacing="1" w:line="240" w:lineRule="auto"/>
+        <w:rPr>
+          <w:rFonts w:ascii="Times New Roman" w:eastAsia="Times New Roman" w:hAnsi="Times New Roman" w:cs="Times New Roman"/>
+          <w:sz w:val="24"/>
+          <w:szCs w:val="24"/>
+          <w:lang w:val="ru-UA"/>
+        </w:rPr>
+      </w:pPr>
+      <w:r>
+        <w:rPr>
+          <w:rFonts w:ascii="Times New Roman" w:eastAsia="Times New Roman" w:hAnsi="Times New Roman" w:cs="Times New Roman"/>
+          <w:sz w:val="24"/>
+          <w:szCs w:val="24"/>
+          <w:lang w:val="ru-UA"/>
+        </w:rPr>
+        <w:t>видно, кто отвечает за задачу;</w:t>
+      </w:r>
+    </w:p>
+    <w:p>
+      <w:pPr>
+        <w:numPr>
+          <w:ilvl w:val="0"/>
+          <w:numId w:val="3"/>
+        </w:numPr>
+        <w:spacing w:before="100" w:beforeAutospacing="1" w:after="100" w:afterAutospacing="1" w:line="240" w:lineRule="auto"/>
+        <w:rPr>
+          <w:rFonts w:ascii="Times New Roman" w:eastAsia="Times New Roman" w:hAnsi="Times New Roman" w:cs="Times New Roman"/>
+          <w:sz w:val="24"/>
+          <w:szCs w:val="24"/>
+        </w:rPr>
+      </w:pPr>
+      <w:r>
+        <w:rPr>
+          <w:rFonts w:ascii="Times New Roman" w:eastAsia="Times New Roman" w:hAnsi="Times New Roman" w:cs="Times New Roman"/>
+          <w:sz w:val="24"/>
+          <w:szCs w:val="24"/>
+        </w:rPr>
+        <w:t xml:space="preserve">есть </w:t>
+      </w:r>
+      <w:proofErr w:type="spellStart"/>
+      <w:r>
+        <w:rPr>
+          <w:rFonts w:ascii="Times New Roman" w:eastAsia="Times New Roman" w:hAnsi="Times New Roman" w:cs="Times New Roman"/>
+          <w:sz w:val="24"/>
+          <w:szCs w:val="24"/>
+        </w:rPr>
+        <w:t>история</w:t>
+      </w:r>
+      <w:proofErr w:type="spellEnd"/>
+      <w:r>
+        <w:rPr>
+          <w:rFonts w:ascii="Times New Roman" w:eastAsia="Times New Roman" w:hAnsi="Times New Roman" w:cs="Times New Roman"/>
+          <w:sz w:val="24"/>
+          <w:szCs w:val="24"/>
+        </w:rPr>
+        <w:t xml:space="preserve"> </w:t>
+      </w:r>
+      <w:proofErr w:type="spellStart"/>
+      <w:r>
+        <w:rPr>
+          <w:rFonts w:ascii="Times New Roman" w:eastAsia="Times New Roman" w:hAnsi="Times New Roman" w:cs="Times New Roman"/>
+          <w:sz w:val="24"/>
+          <w:szCs w:val="24"/>
+        </w:rPr>
+        <w:t>изменений</w:t>
+      </w:r>
+      <w:proofErr w:type="spellEnd"/>
+      <w:r>
+        <w:rPr>
+          <w:rFonts w:ascii="Times New Roman" w:eastAsia="Times New Roman" w:hAnsi="Times New Roman" w:cs="Times New Roman"/>
+          <w:sz w:val="24"/>
+          <w:szCs w:val="24"/>
+        </w:rPr>
+        <w:t>;</w:t>
+      </w:r>
+    </w:p>
+    <w:p>
+      <w:pPr>
+        <w:numPr>
+          <w:ilvl w:val="0"/>
+          <w:numId w:val="3"/>
+        </w:numPr>
+        <w:spacing w:before="100" w:beforeAutospacing="1" w:after="100" w:afterAutospacing="1" w:line="240" w:lineRule="auto"/>
+        <w:rPr>
+          <w:rFonts w:ascii="Times New Roman" w:eastAsia="Times New Roman" w:hAnsi="Times New Roman" w:cs="Times New Roman"/>
+          <w:sz w:val="24"/>
+          <w:szCs w:val="24"/>
+        </w:rPr>
+      </w:pPr>
+      <w:proofErr w:type="spellStart"/>
+      <w:r>
+        <w:rPr>
+          <w:rFonts w:ascii="Times New Roman" w:eastAsia="Times New Roman" w:hAnsi="Times New Roman" w:cs="Times New Roman"/>
+          <w:sz w:val="24"/>
+          <w:szCs w:val="24"/>
+        </w:rPr>
+        <w:t>можно</w:t>
+      </w:r>
+      <w:proofErr w:type="spellEnd"/>
+      <w:r>
+        <w:rPr>
+          <w:rFonts w:ascii="Times New Roman" w:eastAsia="Times New Roman" w:hAnsi="Times New Roman" w:cs="Times New Roman"/>
+          <w:sz w:val="24"/>
+          <w:szCs w:val="24"/>
+        </w:rPr>
+        <w:t xml:space="preserve"> </w:t>
+      </w:r>
+      <w:proofErr w:type="spellStart"/>
+      <w:r>
+        <w:rPr>
+          <w:rFonts w:ascii="Times New Roman" w:eastAsia="Times New Roman" w:hAnsi="Times New Roman" w:cs="Times New Roman"/>
+          <w:sz w:val="24"/>
+          <w:szCs w:val="24"/>
+        </w:rPr>
+        <w:t>ставить</w:t>
+      </w:r>
+      <w:proofErr w:type="spellEnd"/>
+      <w:r>
+        <w:rPr>
+          <w:rFonts w:ascii="Times New Roman" w:eastAsia="Times New Roman" w:hAnsi="Times New Roman" w:cs="Times New Roman"/>
+          <w:sz w:val="24"/>
+          <w:szCs w:val="24"/>
+        </w:rPr>
+        <w:t xml:space="preserve"> labels, priority, estimates;</w:t>
+      </w:r>
+    </w:p>
+    <w:p>
+      <w:pPr>
+        <w:numPr>
+          <w:ilvl w:val="0"/>
+          <w:numId w:val="3"/>
+        </w:numPr>
+        <w:spacing w:before="100" w:beforeAutospacing="1" w:after="100" w:afterAutospacing="1" w:line="240" w:lineRule="auto"/>
+        <w:rPr>
+          <w:rFonts w:ascii="Times New Roman" w:eastAsia="Times New Roman" w:hAnsi="Times New Roman" w:cs="Times New Roman"/>
+          <w:sz w:val="24"/>
+          <w:szCs w:val="24"/>
+        </w:rPr>
+      </w:pPr>
+      <w:proofErr w:type="spellStart"/>
+      <w:r>
+        <w:rPr>
+          <w:rFonts w:ascii="Times New Roman" w:eastAsia="Times New Roman" w:hAnsi="Times New Roman" w:cs="Times New Roman"/>
+          <w:sz w:val="24"/>
+          <w:szCs w:val="24"/>
+        </w:rPr>
+        <w:t>можно</w:t>
+      </w:r>
+      <w:proofErr w:type="spellEnd"/>
+      <w:r>
+        <w:rPr>
+          <w:rFonts w:ascii="Times New Roman" w:eastAsia="Times New Roman" w:hAnsi="Times New Roman" w:cs="Times New Roman"/>
+          <w:sz w:val="24"/>
+          <w:szCs w:val="24"/>
+        </w:rPr>
+        <w:t xml:space="preserve"> </w:t>
+      </w:r>
+      <w:proofErr w:type="spellStart"/>
+      <w:r>
+        <w:rPr>
+          <w:rFonts w:ascii="Times New Roman" w:eastAsia="Times New Roman" w:hAnsi="Times New Roman" w:cs="Times New Roman"/>
+          <w:sz w:val="24"/>
+          <w:szCs w:val="24"/>
+        </w:rPr>
+        <w:t>связывать</w:t>
+      </w:r>
+      <w:proofErr w:type="spellEnd"/>
+      <w:r>
+        <w:rPr>
+          <w:rFonts w:ascii="Times New Roman" w:eastAsia="Times New Roman" w:hAnsi="Times New Roman" w:cs="Times New Roman"/>
+          <w:sz w:val="24"/>
+          <w:szCs w:val="24"/>
+        </w:rPr>
+        <w:t xml:space="preserve"> Issue с </w:t>
+      </w:r>
+      <w:proofErr w:type="spellStart"/>
+      <w:r>
+        <w:rPr>
+          <w:rFonts w:ascii="Times New Roman" w:eastAsia="Times New Roman" w:hAnsi="Times New Roman" w:cs="Times New Roman"/>
+          <w:sz w:val="24"/>
+          <w:szCs w:val="24"/>
+        </w:rPr>
+        <w:t>кодом</w:t>
+      </w:r>
+      <w:proofErr w:type="spellEnd"/>
+      <w:r>
+        <w:rPr>
+          <w:rFonts w:ascii="Times New Roman" w:eastAsia="Times New Roman" w:hAnsi="Times New Roman" w:cs="Times New Roman"/>
+          <w:sz w:val="24"/>
+          <w:szCs w:val="24"/>
+        </w:rPr>
+        <w:t xml:space="preserve"> и Pull Request;</w:t>
+      </w:r>
+    </w:p>
+    <w:p>
+      <w:pPr>
+        <w:numPr>
+          <w:ilvl w:val="0"/>
+          <w:numId w:val="3"/>
+        </w:numPr>
+        <w:spacing w:before="100" w:beforeAutospacing="1" w:after="100" w:afterAutospacing="1" w:line="240" w:lineRule="auto"/>
+        <w:rPr>
+          <w:rFonts w:ascii="Times New Roman" w:eastAsia="Times New Roman" w:hAnsi="Times New Roman" w:cs="Times New Roman"/>
+          <w:sz w:val="24"/>
+          <w:szCs w:val="24"/>
+        </w:rPr>
+      </w:pPr>
+      <w:proofErr w:type="spellStart"/>
+      <w:r>
+        <w:rPr>
+          <w:rFonts w:ascii="Times New Roman" w:eastAsia="Times New Roman" w:hAnsi="Times New Roman" w:cs="Times New Roman"/>
+          <w:sz w:val="24"/>
+          <w:szCs w:val="24"/>
+        </w:rPr>
+        <w:t>видно</w:t>
+      </w:r>
+      <w:proofErr w:type="spellEnd"/>
+      <w:r>
+        <w:rPr>
+          <w:rFonts w:ascii="Times New Roman" w:eastAsia="Times New Roman" w:hAnsi="Times New Roman" w:cs="Times New Roman"/>
+          <w:sz w:val="24"/>
+          <w:szCs w:val="24"/>
+        </w:rPr>
+        <w:t xml:space="preserve">, </w:t>
+      </w:r>
+      <w:proofErr w:type="spellStart"/>
+      <w:r>
+        <w:rPr>
+          <w:rFonts w:ascii="Times New Roman" w:eastAsia="Times New Roman" w:hAnsi="Times New Roman" w:cs="Times New Roman"/>
+          <w:sz w:val="24"/>
+          <w:szCs w:val="24"/>
+        </w:rPr>
+        <w:t>сколько</w:t>
+      </w:r>
+      <w:proofErr w:type="spellEnd"/>
+      <w:r>
+        <w:rPr>
+          <w:rFonts w:ascii="Times New Roman" w:eastAsia="Times New Roman" w:hAnsi="Times New Roman" w:cs="Times New Roman"/>
+          <w:sz w:val="24"/>
+          <w:szCs w:val="24"/>
+        </w:rPr>
+        <w:t xml:space="preserve"> </w:t>
+      </w:r>
+      <w:proofErr w:type="spellStart"/>
+      <w:r>
+        <w:rPr>
+          <w:rFonts w:ascii="Times New Roman" w:eastAsia="Times New Roman" w:hAnsi="Times New Roman" w:cs="Times New Roman"/>
+          <w:sz w:val="24"/>
+          <w:szCs w:val="24"/>
+        </w:rPr>
+        <w:t>задач</w:t>
+      </w:r>
+      <w:proofErr w:type="spellEnd"/>
+      <w:r>
+        <w:rPr>
+          <w:rFonts w:ascii="Times New Roman" w:eastAsia="Times New Roman" w:hAnsi="Times New Roman" w:cs="Times New Roman"/>
+          <w:sz w:val="24"/>
+          <w:szCs w:val="24"/>
+        </w:rPr>
+        <w:t xml:space="preserve"> в </w:t>
+      </w:r>
+      <w:proofErr w:type="spellStart"/>
+      <w:r>
+        <w:rPr>
+          <w:rFonts w:ascii="Times New Roman" w:eastAsia="Times New Roman" w:hAnsi="Times New Roman" w:cs="Times New Roman"/>
+          <w:sz w:val="24"/>
+          <w:szCs w:val="24"/>
+        </w:rPr>
+        <w:t>работе</w:t>
+      </w:r>
+      <w:proofErr w:type="spellEnd"/>
+      <w:r>
+        <w:rPr>
+          <w:rFonts w:ascii="Times New Roman" w:eastAsia="Times New Roman" w:hAnsi="Times New Roman" w:cs="Times New Roman"/>
+          <w:sz w:val="24"/>
+          <w:szCs w:val="24"/>
+        </w:rPr>
+        <w:t xml:space="preserve"> и </w:t>
+      </w:r>
+      <w:proofErr w:type="spellStart"/>
+      <w:r>
+        <w:rPr>
+          <w:rFonts w:ascii="Times New Roman" w:eastAsia="Times New Roman" w:hAnsi="Times New Roman" w:cs="Times New Roman"/>
+          <w:sz w:val="24"/>
+          <w:szCs w:val="24"/>
+        </w:rPr>
+        <w:t>где</w:t>
+      </w:r>
+      <w:proofErr w:type="spellEnd"/>
+      <w:r>
+        <w:rPr>
+          <w:rFonts w:ascii="Times New Roman" w:eastAsia="Times New Roman" w:hAnsi="Times New Roman" w:cs="Times New Roman"/>
+          <w:sz w:val="24"/>
+          <w:szCs w:val="24"/>
+        </w:rPr>
+        <w:t xml:space="preserve"> </w:t>
+      </w:r>
+      <w:proofErr w:type="spellStart"/>
+      <w:r>
+        <w:rPr>
+          <w:rFonts w:ascii="Times New Roman" w:eastAsia="Times New Roman" w:hAnsi="Times New Roman" w:cs="Times New Roman"/>
+          <w:sz w:val="24"/>
+          <w:szCs w:val="24"/>
+        </w:rPr>
+        <w:t>застряли</w:t>
+      </w:r>
+      <w:proofErr w:type="spellEnd"/>
+      <w:r>
+        <w:rPr>
+          <w:rFonts w:ascii="Times New Roman" w:eastAsia="Times New Roman" w:hAnsi="Times New Roman" w:cs="Times New Roman"/>
+          <w:sz w:val="24"/>
+          <w:szCs w:val="24"/>
+        </w:rPr>
+        <w:t>;</w:t>
+      </w:r>
+    </w:p>
+    <w:p>
+      <w:pPr>
+        <w:numPr>
+          <w:ilvl w:val="0"/>
+          <w:numId w:val="3"/>
+        </w:numPr>
+        <w:spacing w:before="100" w:beforeAutospacing="1" w:after="100" w:afterAutospacing="1" w:line="240" w:lineRule="auto"/>
+        <w:rPr>
+          <w:lang w:val="uk-UA"/>
+        </w:rPr>
+      </w:pPr>
+      <w:proofErr w:type="spellStart"/>
+      <w:r>
+        <w:rPr>
+          <w:rFonts w:ascii="Times New Roman" w:eastAsia="Times New Roman" w:hAnsi="Times New Roman" w:cs="Times New Roman"/>
+          <w:sz w:val="24"/>
+          <w:szCs w:val="24"/>
+        </w:rPr>
+        <w:t>можно</w:t>
+      </w:r>
+      <w:proofErr w:type="spellEnd"/>
+      <w:r>
+        <w:rPr>
+          <w:rFonts w:ascii="Times New Roman" w:eastAsia="Times New Roman" w:hAnsi="Times New Roman" w:cs="Times New Roman"/>
+          <w:sz w:val="24"/>
+          <w:szCs w:val="24"/>
+        </w:rPr>
+        <w:t xml:space="preserve"> </w:t>
+      </w:r>
+      <w:proofErr w:type="spellStart"/>
+      <w:r>
+        <w:rPr>
+          <w:rFonts w:ascii="Times New Roman" w:eastAsia="Times New Roman" w:hAnsi="Times New Roman" w:cs="Times New Roman"/>
+          <w:sz w:val="24"/>
+          <w:szCs w:val="24"/>
+        </w:rPr>
+        <w:t>автоматизировать</w:t>
+      </w:r>
+      <w:proofErr w:type="spellEnd"/>
+      <w:r>
+        <w:rPr>
+          <w:rFonts w:ascii="Times New Roman" w:eastAsia="Times New Roman" w:hAnsi="Times New Roman" w:cs="Times New Roman"/>
+          <w:sz w:val="24"/>
+          <w:szCs w:val="24"/>
+        </w:rPr>
+        <w:t xml:space="preserve"> </w:t>
+      </w:r>
+      <w:proofErr w:type="spellStart"/>
+      <w:r>
+        <w:rPr>
+          <w:rFonts w:ascii="Times New Roman" w:eastAsia="Times New Roman" w:hAnsi="Times New Roman" w:cs="Times New Roman"/>
+          <w:sz w:val="24"/>
+          <w:szCs w:val="24"/>
+        </w:rPr>
+        <w:t>переходы</w:t>
+      </w:r>
+      <w:proofErr w:type="spellEnd"/>
+      <w:r>
+        <w:rPr>
+          <w:rFonts w:ascii="Times New Roman" w:eastAsia="Times New Roman" w:hAnsi="Times New Roman" w:cs="Times New Roman"/>
+          <w:sz w:val="24"/>
+          <w:szCs w:val="24"/>
+        </w:rPr>
+        <w:t xml:space="preserve">, как у </w:t>
+      </w:r>
+      <w:proofErr w:type="spellStart"/>
+      <w:r>
+        <w:rPr>
+          <w:rFonts w:ascii="Times New Roman" w:eastAsia="Times New Roman" w:hAnsi="Times New Roman" w:cs="Times New Roman"/>
+          <w:sz w:val="24"/>
+          <w:szCs w:val="24"/>
+        </w:rPr>
+        <w:t>тебя</w:t>
+      </w:r>
+      <w:proofErr w:type="spellEnd"/>
+      <w:r>
+        <w:rPr>
+          <w:rFonts w:ascii="Times New Roman" w:eastAsia="Times New Roman" w:hAnsi="Times New Roman" w:cs="Times New Roman"/>
+          <w:sz w:val="24"/>
+          <w:szCs w:val="24"/>
+        </w:rPr>
+        <w:t xml:space="preserve"> </w:t>
+      </w:r>
+      <w:r>
+        <w:rPr>
+          <w:rFonts w:ascii="Courier New" w:eastAsia="Times New Roman" w:hAnsi="Courier New" w:cs="Courier New"/>
+          <w:sz w:val="20"/>
+          <w:szCs w:val="20"/>
+        </w:rPr>
+        <w:t>Close issue → Done</w:t>
+      </w:r>
+      <w:r>
+        <w:rPr>
+          <w:rFonts w:ascii="Times New Roman" w:eastAsia="Times New Roman" w:hAnsi="Times New Roman" w:cs="Times New Roman"/>
+          <w:sz w:val="24"/>
+          <w:szCs w:val="24"/>
+        </w:rPr>
+        <w:t>.</w:t>
+      </w:r>
+      <w:r>
+        <w:rPr>
+          <w:lang w:val="uk-UA"/>
+        </w:rPr>
+        <w:drawing>
+          <wp:inline distT="0" distB="0" distL="0" distR="0" wp14:anchorId="12FF636D" wp14:editId="61BBE849">
+            <wp:extent cx="6858000" cy="1623060"/>
+            <wp:effectExtent l="0" t="0" r="0" b="0"/>
+            <wp:docPr id="17" name="Grafik 17"/>
+            <wp:cNvGraphicFramePr>
+              <a:graphicFrameLocks xmlns:a="http://schemas.openxmlformats.org/drawingml/2006/main" noChangeAspect="1"/>
+            </wp:cNvGraphicFramePr>
+            <a:graphic xmlns:a="http://schemas.openxmlformats.org/drawingml/2006/main">
+              <a:graphicData uri="http://schemas.openxmlformats.org/drawingml/2006/picture">
+                <pic:pic xmlns:pic="http://schemas.openxmlformats.org/drawingml/2006/picture">
+                  <pic:nvPicPr>
+                    <pic:cNvPr id="1" name=""/>
+                    <pic:cNvPicPr/>
+                  </pic:nvPicPr>
+                  <pic:blipFill>
+                    <a:blip r:embed="rId10"/>
+                    <a:stretch>
+                      <a:fillRect/>
+                    </a:stretch>
+                  </pic:blipFill>
+                  <pic:spPr>
+                    <a:xfrm>
+                      <a:off x="0" y="0"/>
+                      <a:ext cx="6858000" cy="1623060"/>
+                    </a:xfrm>
+                    <a:prstGeom prst="rect">
+                      <a:avLst/>
+                    </a:prstGeom>
+                  </pic:spPr>
+                </pic:pic>
+              </a:graphicData>
+            </a:graphic>
+          </wp:inline>
+        </w:drawing>
+      </w:r>
+    </w:p>
+    <w:p>
+      <w:pPr>
+        <w:spacing w:before="100" w:beforeAutospacing="1" w:after="100" w:afterAutospacing="1" w:line="240" w:lineRule="auto"/>
+        <w:rPr>
+          <w:lang w:val="de-DE"/>
+        </w:rPr>
+      </w:pPr>
+      <w:r>
+        <w:rPr>
+          <w:lang w:val="uk-UA"/>
+        </w:rPr>
+        <w:lastRenderedPageBreak/>
+        <w:drawing>
+          <wp:inline distT="0" distB="0" distL="0" distR="0" wp14:anchorId="496A88B3" wp14:editId="21B664F8">
+            <wp:extent cx="6858000" cy="2664460"/>
+            <wp:effectExtent l="0" t="0" r="0" b="2540"/>
+            <wp:docPr id="18" name="Grafik 18"/>
+            <wp:cNvGraphicFramePr>
+              <a:graphicFrameLocks xmlns:a="http://schemas.openxmlformats.org/drawingml/2006/main" noChangeAspect="1"/>
+            </wp:cNvGraphicFramePr>
+            <a:graphic xmlns:a="http://schemas.openxmlformats.org/drawingml/2006/main">
+              <a:graphicData uri="http://schemas.openxmlformats.org/drawingml/2006/picture">
+                <pic:pic xmlns:pic="http://schemas.openxmlformats.org/drawingml/2006/picture">
+                  <pic:nvPicPr>
+                    <pic:cNvPr id="1" name=""/>
+                    <pic:cNvPicPr/>
+                  </pic:nvPicPr>
+                  <pic:blipFill>
+                    <a:blip r:embed="rId11"/>
+                    <a:stretch>
+                      <a:fillRect/>
+                    </a:stretch>
+                  </pic:blipFill>
+                  <pic:spPr>
+                    <a:xfrm>
+                      <a:off x="0" y="0"/>
+                      <a:ext cx="6858000" cy="2664460"/>
+                    </a:xfrm>
+                    <a:prstGeom prst="rect">
+                      <a:avLst/>
+                    </a:prstGeom>
+                  </pic:spPr>
+                </pic:pic>
+              </a:graphicData>
+            </a:graphic>
+          </wp:inline>
+        </w:drawing>
+      </w:r>
+      <w:r>
+        <w:t>s</w:t>
+      </w:r>
+    </w:p>
     <w:sectPr>
       <w:pgSz w:w="12240" w:h="15840"/>
       <w:pgMar w:top="720" w:right="720" w:bottom="720" w:left="720" w:header="720" w:footer="720" w:gutter="0"/>
@@ -163,6 +1852,467 @@
     </w:sectPr>
   </w:body>
 </w:document>
+</file>
+
+<file path=word/numbering.xml><?xml version="1.0" encoding="utf-8"?>
+<w:numbering xmlns:wpc="http://schemas.microsoft.com/office/word/2010/wordprocessingCanvas" xmlns:cx="http://schemas.microsoft.com/office/drawing/2014/chartex" xmlns:cx1="http://schemas.microsoft.com/office/drawing/2015/9/8/chartex" xmlns:cx2="http://schemas.microsoft.com/office/drawing/2015/10/21/chartex" xmlns:cx3="http://schemas.microsoft.com/office/drawing/2016/5/9/chartex" xmlns:cx4="http://schemas.microsoft.com/office/drawing/2016/5/10/chartex" xmlns:cx5="http://schemas.microsoft.com/office/drawing/2016/5/11/chartex" xmlns:cx6="http://schemas.microsoft.com/office/drawing/2016/5/12/chartex" xmlns:cx7="http://schemas.microsoft.com/office/drawing/2016/5/13/chartex" xmlns:cx8="http://schemas.microsoft.com/office/drawing/2016/5/14/chartex" xmlns:mc="http://schemas.openxmlformats.org/markup-compatibility/2006" xmlns:aink="http://schemas.microsoft.com/office/drawing/2016/ink" xmlns:am3d="http://schemas.microsoft.com/office/drawing/2017/model3d" xmlns:o="urn:schemas-microsoft-com:office:office" xmlns:r="http://schemas.openxmlformats.org/officeDocument/2006/relationships" xmlns:m="http://schemas.openxmlformats.org/officeDocument/2006/math" xmlns:v="urn:schemas-microsoft-com:vml" xmlns:wp14="http://schemas.microsoft.com/office/word/2010/wordprocessingDrawing" xmlns:wp="http://schemas.openxmlformats.org/drawingml/2006/wordprocessingDrawing" xmlns:w10="urn:schemas-microsoft-com:office:word" xmlns:w="http://schemas.openxmlformats.org/wordprocessingml/2006/main" xmlns:w14="http://schemas.microsoft.com/office/word/2010/wordml" xmlns:w15="http://schemas.microsoft.com/office/word/2012/wordml" xmlns:w16cex="http://schemas.microsoft.com/office/word/2018/wordml/cex" xmlns:w16cid="http://schemas.microsoft.com/office/word/2016/wordml/cid" xmlns:w16="http://schemas.microsoft.com/office/word/2018/wordml" xmlns:w16sdtdh="http://schemas.microsoft.com/office/word/2020/wordml/sdtdatahash" xmlns:w16se="http://schemas.microsoft.com/office/word/2015/wordml/symex" xmlns:wpg="http://schemas.microsoft.com/office/word/2010/wordprocessingGroup" xmlns:wpi="http://schemas.microsoft.com/office/word/2010/wordprocessingInk" xmlns:wne="http://schemas.microsoft.com/office/word/2006/wordml" xmlns:wps="http://schemas.microsoft.com/office/word/2010/wordprocessingShape" mc:Ignorable="w14 w15 w16se w16cid w16 w16cex w16sdtdh wp14">
+  <w:abstractNum w:abstractNumId="0" w15:restartNumberingAfterBreak="0">
+    <w:nsid w:val="141E0549"/>
+    <w:multiLevelType w:val="multilevel"/>
+    <w:tmpl w:val="E7987204"/>
+    <w:lvl w:ilvl="0">
+      <w:start w:val="1"/>
+      <w:numFmt w:val="bullet"/>
+      <w:lvlText w:val=""/>
+      <w:lvlJc w:val="left"/>
+      <w:pPr>
+        <w:tabs>
+          <w:tab w:val="num" w:pos="720"/>
+        </w:tabs>
+        <w:ind w:left="720" w:hanging="360"/>
+      </w:pPr>
+      <w:rPr>
+        <w:rFonts w:ascii="Symbol" w:hAnsi="Symbol" w:hint="default"/>
+        <w:sz w:val="20"/>
+      </w:rPr>
+    </w:lvl>
+    <w:lvl w:ilvl="1" w:tentative="1">
+      <w:start w:val="1"/>
+      <w:numFmt w:val="bullet"/>
+      <w:lvlText w:val=""/>
+      <w:lvlJc w:val="left"/>
+      <w:pPr>
+        <w:tabs>
+          <w:tab w:val="num" w:pos="1440"/>
+        </w:tabs>
+        <w:ind w:left="1440" w:hanging="360"/>
+      </w:pPr>
+      <w:rPr>
+        <w:rFonts w:ascii="Symbol" w:hAnsi="Symbol" w:hint="default"/>
+        <w:sz w:val="20"/>
+      </w:rPr>
+    </w:lvl>
+    <w:lvl w:ilvl="2" w:tentative="1">
+      <w:start w:val="1"/>
+      <w:numFmt w:val="bullet"/>
+      <w:lvlText w:val=""/>
+      <w:lvlJc w:val="left"/>
+      <w:pPr>
+        <w:tabs>
+          <w:tab w:val="num" w:pos="2160"/>
+        </w:tabs>
+        <w:ind w:left="2160" w:hanging="360"/>
+      </w:pPr>
+      <w:rPr>
+        <w:rFonts w:ascii="Symbol" w:hAnsi="Symbol" w:hint="default"/>
+        <w:sz w:val="20"/>
+      </w:rPr>
+    </w:lvl>
+    <w:lvl w:ilvl="3" w:tentative="1">
+      <w:start w:val="1"/>
+      <w:numFmt w:val="bullet"/>
+      <w:lvlText w:val=""/>
+      <w:lvlJc w:val="left"/>
+      <w:pPr>
+        <w:tabs>
+          <w:tab w:val="num" w:pos="2880"/>
+        </w:tabs>
+        <w:ind w:left="2880" w:hanging="360"/>
+      </w:pPr>
+      <w:rPr>
+        <w:rFonts w:ascii="Symbol" w:hAnsi="Symbol" w:hint="default"/>
+        <w:sz w:val="20"/>
+      </w:rPr>
+    </w:lvl>
+    <w:lvl w:ilvl="4" w:tentative="1">
+      <w:start w:val="1"/>
+      <w:numFmt w:val="bullet"/>
+      <w:lvlText w:val=""/>
+      <w:lvlJc w:val="left"/>
+      <w:pPr>
+        <w:tabs>
+          <w:tab w:val="num" w:pos="3600"/>
+        </w:tabs>
+        <w:ind w:left="3600" w:hanging="360"/>
+      </w:pPr>
+      <w:rPr>
+        <w:rFonts w:ascii="Symbol" w:hAnsi="Symbol" w:hint="default"/>
+        <w:sz w:val="20"/>
+      </w:rPr>
+    </w:lvl>
+    <w:lvl w:ilvl="5" w:tentative="1">
+      <w:start w:val="1"/>
+      <w:numFmt w:val="bullet"/>
+      <w:lvlText w:val=""/>
+      <w:lvlJc w:val="left"/>
+      <w:pPr>
+        <w:tabs>
+          <w:tab w:val="num" w:pos="4320"/>
+        </w:tabs>
+        <w:ind w:left="4320" w:hanging="360"/>
+      </w:pPr>
+      <w:rPr>
+        <w:rFonts w:ascii="Symbol" w:hAnsi="Symbol" w:hint="default"/>
+        <w:sz w:val="20"/>
+      </w:rPr>
+    </w:lvl>
+    <w:lvl w:ilvl="6" w:tentative="1">
+      <w:start w:val="1"/>
+      <w:numFmt w:val="bullet"/>
+      <w:lvlText w:val=""/>
+      <w:lvlJc w:val="left"/>
+      <w:pPr>
+        <w:tabs>
+          <w:tab w:val="num" w:pos="5040"/>
+        </w:tabs>
+        <w:ind w:left="5040" w:hanging="360"/>
+      </w:pPr>
+      <w:rPr>
+        <w:rFonts w:ascii="Symbol" w:hAnsi="Symbol" w:hint="default"/>
+        <w:sz w:val="20"/>
+      </w:rPr>
+    </w:lvl>
+    <w:lvl w:ilvl="7" w:tentative="1">
+      <w:start w:val="1"/>
+      <w:numFmt w:val="bullet"/>
+      <w:lvlText w:val=""/>
+      <w:lvlJc w:val="left"/>
+      <w:pPr>
+        <w:tabs>
+          <w:tab w:val="num" w:pos="5760"/>
+        </w:tabs>
+        <w:ind w:left="5760" w:hanging="360"/>
+      </w:pPr>
+      <w:rPr>
+        <w:rFonts w:ascii="Symbol" w:hAnsi="Symbol" w:hint="default"/>
+        <w:sz w:val="20"/>
+      </w:rPr>
+    </w:lvl>
+    <w:lvl w:ilvl="8" w:tentative="1">
+      <w:start w:val="1"/>
+      <w:numFmt w:val="bullet"/>
+      <w:lvlText w:val=""/>
+      <w:lvlJc w:val="left"/>
+      <w:pPr>
+        <w:tabs>
+          <w:tab w:val="num" w:pos="6480"/>
+        </w:tabs>
+        <w:ind w:left="6480" w:hanging="360"/>
+      </w:pPr>
+      <w:rPr>
+        <w:rFonts w:ascii="Symbol" w:hAnsi="Symbol" w:hint="default"/>
+        <w:sz w:val="20"/>
+      </w:rPr>
+    </w:lvl>
+  </w:abstractNum>
+  <w:abstractNum w:abstractNumId="1" w15:restartNumberingAfterBreak="0">
+    <w:nsid w:val="49CE2A9D"/>
+    <w:multiLevelType w:val="multilevel"/>
+    <w:tmpl w:val="E6C80A10"/>
+    <w:lvl w:ilvl="0">
+      <w:start w:val="1"/>
+      <w:numFmt w:val="bullet"/>
+      <w:lvlText w:val=""/>
+      <w:lvlJc w:val="left"/>
+      <w:pPr>
+        <w:tabs>
+          <w:tab w:val="num" w:pos="720"/>
+        </w:tabs>
+        <w:ind w:left="720" w:hanging="360"/>
+      </w:pPr>
+      <w:rPr>
+        <w:rFonts w:ascii="Symbol" w:hAnsi="Symbol" w:hint="default"/>
+        <w:sz w:val="20"/>
+      </w:rPr>
+    </w:lvl>
+    <w:lvl w:ilvl="1" w:tentative="1">
+      <w:start w:val="1"/>
+      <w:numFmt w:val="bullet"/>
+      <w:lvlText w:val="o"/>
+      <w:lvlJc w:val="left"/>
+      <w:pPr>
+        <w:tabs>
+          <w:tab w:val="num" w:pos="1440"/>
+        </w:tabs>
+        <w:ind w:left="1440" w:hanging="360"/>
+      </w:pPr>
+      <w:rPr>
+        <w:rFonts w:ascii="Courier New" w:hAnsi="Courier New" w:hint="default"/>
+        <w:sz w:val="20"/>
+      </w:rPr>
+    </w:lvl>
+    <w:lvl w:ilvl="2" w:tentative="1">
+      <w:start w:val="1"/>
+      <w:numFmt w:val="bullet"/>
+      <w:lvlText w:val=""/>
+      <w:lvlJc w:val="left"/>
+      <w:pPr>
+        <w:tabs>
+          <w:tab w:val="num" w:pos="2160"/>
+        </w:tabs>
+        <w:ind w:left="2160" w:hanging="360"/>
+      </w:pPr>
+      <w:rPr>
+        <w:rFonts w:ascii="Wingdings" w:hAnsi="Wingdings" w:hint="default"/>
+        <w:sz w:val="20"/>
+      </w:rPr>
+    </w:lvl>
+    <w:lvl w:ilvl="3" w:tentative="1">
+      <w:start w:val="1"/>
+      <w:numFmt w:val="bullet"/>
+      <w:lvlText w:val=""/>
+      <w:lvlJc w:val="left"/>
+      <w:pPr>
+        <w:tabs>
+          <w:tab w:val="num" w:pos="2880"/>
+        </w:tabs>
+        <w:ind w:left="2880" w:hanging="360"/>
+      </w:pPr>
+      <w:rPr>
+        <w:rFonts w:ascii="Wingdings" w:hAnsi="Wingdings" w:hint="default"/>
+        <w:sz w:val="20"/>
+      </w:rPr>
+    </w:lvl>
+    <w:lvl w:ilvl="4" w:tentative="1">
+      <w:start w:val="1"/>
+      <w:numFmt w:val="bullet"/>
+      <w:lvlText w:val=""/>
+      <w:lvlJc w:val="left"/>
+      <w:pPr>
+        <w:tabs>
+          <w:tab w:val="num" w:pos="3600"/>
+        </w:tabs>
+        <w:ind w:left="3600" w:hanging="360"/>
+      </w:pPr>
+      <w:rPr>
+        <w:rFonts w:ascii="Wingdings" w:hAnsi="Wingdings" w:hint="default"/>
+        <w:sz w:val="20"/>
+      </w:rPr>
+    </w:lvl>
+    <w:lvl w:ilvl="5" w:tentative="1">
+      <w:start w:val="1"/>
+      <w:numFmt w:val="bullet"/>
+      <w:lvlText w:val=""/>
+      <w:lvlJc w:val="left"/>
+      <w:pPr>
+        <w:tabs>
+          <w:tab w:val="num" w:pos="4320"/>
+        </w:tabs>
+        <w:ind w:left="4320" w:hanging="360"/>
+      </w:pPr>
+      <w:rPr>
+        <w:rFonts w:ascii="Wingdings" w:hAnsi="Wingdings" w:hint="default"/>
+        <w:sz w:val="20"/>
+      </w:rPr>
+    </w:lvl>
+    <w:lvl w:ilvl="6" w:tentative="1">
+      <w:start w:val="1"/>
+      <w:numFmt w:val="bullet"/>
+      <w:lvlText w:val=""/>
+      <w:lvlJc w:val="left"/>
+      <w:pPr>
+        <w:tabs>
+          <w:tab w:val="num" w:pos="5040"/>
+        </w:tabs>
+        <w:ind w:left="5040" w:hanging="360"/>
+      </w:pPr>
+      <w:rPr>
+        <w:rFonts w:ascii="Wingdings" w:hAnsi="Wingdings" w:hint="default"/>
+        <w:sz w:val="20"/>
+      </w:rPr>
+    </w:lvl>
+    <w:lvl w:ilvl="7" w:tentative="1">
+      <w:start w:val="1"/>
+      <w:numFmt w:val="bullet"/>
+      <w:lvlText w:val=""/>
+      <w:lvlJc w:val="left"/>
+      <w:pPr>
+        <w:tabs>
+          <w:tab w:val="num" w:pos="5760"/>
+        </w:tabs>
+        <w:ind w:left="5760" w:hanging="360"/>
+      </w:pPr>
+      <w:rPr>
+        <w:rFonts w:ascii="Wingdings" w:hAnsi="Wingdings" w:hint="default"/>
+        <w:sz w:val="20"/>
+      </w:rPr>
+    </w:lvl>
+    <w:lvl w:ilvl="8" w:tentative="1">
+      <w:start w:val="1"/>
+      <w:numFmt w:val="bullet"/>
+      <w:lvlText w:val=""/>
+      <w:lvlJc w:val="left"/>
+      <w:pPr>
+        <w:tabs>
+          <w:tab w:val="num" w:pos="6480"/>
+        </w:tabs>
+        <w:ind w:left="6480" w:hanging="360"/>
+      </w:pPr>
+      <w:rPr>
+        <w:rFonts w:ascii="Wingdings" w:hAnsi="Wingdings" w:hint="default"/>
+        <w:sz w:val="20"/>
+      </w:rPr>
+    </w:lvl>
+  </w:abstractNum>
+  <w:abstractNum w:abstractNumId="2" w15:restartNumberingAfterBreak="0">
+    <w:nsid w:val="7B485730"/>
+    <w:multiLevelType w:val="multilevel"/>
+    <w:tmpl w:val="162CFBA2"/>
+    <w:lvl w:ilvl="0">
+      <w:start w:val="1"/>
+      <w:numFmt w:val="bullet"/>
+      <w:lvlText w:val=""/>
+      <w:lvlJc w:val="left"/>
+      <w:pPr>
+        <w:tabs>
+          <w:tab w:val="num" w:pos="720"/>
+        </w:tabs>
+        <w:ind w:left="720" w:hanging="360"/>
+      </w:pPr>
+      <w:rPr>
+        <w:rFonts w:ascii="Symbol" w:hAnsi="Symbol" w:hint="default"/>
+        <w:sz w:val="20"/>
+      </w:rPr>
+    </w:lvl>
+    <w:lvl w:ilvl="1" w:tentative="1">
+      <w:start w:val="1"/>
+      <w:numFmt w:val="bullet"/>
+      <w:lvlText w:val="o"/>
+      <w:lvlJc w:val="left"/>
+      <w:pPr>
+        <w:tabs>
+          <w:tab w:val="num" w:pos="1440"/>
+        </w:tabs>
+        <w:ind w:left="1440" w:hanging="360"/>
+      </w:pPr>
+      <w:rPr>
+        <w:rFonts w:ascii="Courier New" w:hAnsi="Courier New" w:hint="default"/>
+        <w:sz w:val="20"/>
+      </w:rPr>
+    </w:lvl>
+    <w:lvl w:ilvl="2" w:tentative="1">
+      <w:start w:val="1"/>
+      <w:numFmt w:val="bullet"/>
+      <w:lvlText w:val=""/>
+      <w:lvlJc w:val="left"/>
+      <w:pPr>
+        <w:tabs>
+          <w:tab w:val="num" w:pos="2160"/>
+        </w:tabs>
+        <w:ind w:left="2160" w:hanging="360"/>
+      </w:pPr>
+      <w:rPr>
+        <w:rFonts w:ascii="Wingdings" w:hAnsi="Wingdings" w:hint="default"/>
+        <w:sz w:val="20"/>
+      </w:rPr>
+    </w:lvl>
+    <w:lvl w:ilvl="3" w:tentative="1">
+      <w:start w:val="1"/>
+      <w:numFmt w:val="bullet"/>
+      <w:lvlText w:val=""/>
+      <w:lvlJc w:val="left"/>
+      <w:pPr>
+        <w:tabs>
+          <w:tab w:val="num" w:pos="2880"/>
+        </w:tabs>
+        <w:ind w:left="2880" w:hanging="360"/>
+      </w:pPr>
+      <w:rPr>
+        <w:rFonts w:ascii="Wingdings" w:hAnsi="Wingdings" w:hint="default"/>
+        <w:sz w:val="20"/>
+      </w:rPr>
+    </w:lvl>
+    <w:lvl w:ilvl="4" w:tentative="1">
+      <w:start w:val="1"/>
+      <w:numFmt w:val="bullet"/>
+      <w:lvlText w:val=""/>
+      <w:lvlJc w:val="left"/>
+      <w:pPr>
+        <w:tabs>
+          <w:tab w:val="num" w:pos="3600"/>
+        </w:tabs>
+        <w:ind w:left="3600" w:hanging="360"/>
+      </w:pPr>
+      <w:rPr>
+        <w:rFonts w:ascii="Wingdings" w:hAnsi="Wingdings" w:hint="default"/>
+        <w:sz w:val="20"/>
+      </w:rPr>
+    </w:lvl>
+    <w:lvl w:ilvl="5" w:tentative="1">
+      <w:start w:val="1"/>
+      <w:numFmt w:val="bullet"/>
+      <w:lvlText w:val=""/>
+      <w:lvlJc w:val="left"/>
+      <w:pPr>
+        <w:tabs>
+          <w:tab w:val="num" w:pos="4320"/>
+        </w:tabs>
+        <w:ind w:left="4320" w:hanging="360"/>
+      </w:pPr>
+      <w:rPr>
+        <w:rFonts w:ascii="Wingdings" w:hAnsi="Wingdings" w:hint="default"/>
+        <w:sz w:val="20"/>
+      </w:rPr>
+    </w:lvl>
+    <w:lvl w:ilvl="6" w:tentative="1">
+      <w:start w:val="1"/>
+      <w:numFmt w:val="bullet"/>
+      <w:lvlText w:val=""/>
+      <w:lvlJc w:val="left"/>
+      <w:pPr>
+        <w:tabs>
+          <w:tab w:val="num" w:pos="5040"/>
+        </w:tabs>
+        <w:ind w:left="5040" w:hanging="360"/>
+      </w:pPr>
+      <w:rPr>
+        <w:rFonts w:ascii="Wingdings" w:hAnsi="Wingdings" w:hint="default"/>
+        <w:sz w:val="20"/>
+      </w:rPr>
+    </w:lvl>
+    <w:lvl w:ilvl="7" w:tentative="1">
+      <w:start w:val="1"/>
+      <w:numFmt w:val="bullet"/>
+      <w:lvlText w:val=""/>
+      <w:lvlJc w:val="left"/>
+      <w:pPr>
+        <w:tabs>
+          <w:tab w:val="num" w:pos="5760"/>
+        </w:tabs>
+        <w:ind w:left="5760" w:hanging="360"/>
+      </w:pPr>
+      <w:rPr>
+        <w:rFonts w:ascii="Wingdings" w:hAnsi="Wingdings" w:hint="default"/>
+        <w:sz w:val="20"/>
+      </w:rPr>
+    </w:lvl>
+    <w:lvl w:ilvl="8" w:tentative="1">
+      <w:start w:val="1"/>
+      <w:numFmt w:val="bullet"/>
+      <w:lvlText w:val=""/>
+      <w:lvlJc w:val="left"/>
+      <w:pPr>
+        <w:tabs>
+          <w:tab w:val="num" w:pos="6480"/>
+        </w:tabs>
+        <w:ind w:left="6480" w:hanging="360"/>
+      </w:pPr>
+      <w:rPr>
+        <w:rFonts w:ascii="Wingdings" w:hAnsi="Wingdings" w:hint="default"/>
+        <w:sz w:val="20"/>
+      </w:rPr>
+    </w:lvl>
+  </w:abstractNum>
+  <w:num w:numId="1">
+    <w:abstractNumId w:val="2"/>
+  </w:num>
+  <w:num w:numId="2">
+    <w:abstractNumId w:val="0"/>
+  </w:num>
+  <w:num w:numId="3">
+    <w:abstractNumId w:val="1"/>
+  </w:num>
+</w:numbering>
 </file>
 
 <file path=word/styles.xml><?xml version="1.0" encoding="utf-8"?>
@@ -587,7 +2737,6 @@
   <w:style w:type="character" w:default="1" w:styleId="Absatz-Standardschriftart">
     <w:name w:val="Default Paragraph Font"/>
     <w:uiPriority w:val="1"/>
-    <w:semiHidden/>
     <w:unhideWhenUsed/>
   </w:style>
   <w:style w:type="table" w:default="1" w:styleId="NormaleTabelle">
@@ -624,6 +2773,46 @@
       <w:kern w:val="36"/>
       <w:sz w:val="48"/>
       <w:szCs w:val="48"/>
+    </w:rPr>
+  </w:style>
+  <w:style w:type="paragraph" w:styleId="StandardWeb">
+    <w:name w:val="Normal (Web)"/>
+    <w:basedOn w:val="Standard"/>
+    <w:uiPriority w:val="99"/>
+    <w:semiHidden/>
+    <w:unhideWhenUsed/>
+    <w:rsid w:val="007C6E7F"/>
+    <w:pPr>
+      <w:spacing w:before="100" w:beforeAutospacing="1" w:after="100" w:afterAutospacing="1" w:line="240" w:lineRule="auto"/>
+    </w:pPr>
+    <w:rPr>
+      <w:rFonts w:ascii="Times New Roman" w:eastAsia="Times New Roman" w:hAnsi="Times New Roman" w:cs="Times New Roman"/>
+      <w:sz w:val="24"/>
+      <w:szCs w:val="24"/>
+    </w:rPr>
+  </w:style>
+  <w:style w:type="character" w:styleId="HTMLCode">
+    <w:name w:val="HTML Code"/>
+    <w:basedOn w:val="Absatz-Standardschriftart"/>
+    <w:uiPriority w:val="99"/>
+    <w:semiHidden/>
+    <w:unhideWhenUsed/>
+    <w:rsid w:val="007C6E7F"/>
+    <w:rPr>
+      <w:rFonts w:ascii="Courier New" w:eastAsia="Times New Roman" w:hAnsi="Courier New" w:cs="Courier New"/>
+      <w:sz w:val="20"/>
+      <w:szCs w:val="20"/>
+    </w:rPr>
+  </w:style>
+  <w:style w:type="character" w:styleId="Fett">
+    <w:name w:val="Strong"/>
+    <w:basedOn w:val="Absatz-Standardschriftart"/>
+    <w:uiPriority w:val="22"/>
+    <w:qFormat/>
+    <w:rsid w:val="007C6E7F"/>
+    <w:rPr>
+      <w:b/>
+      <w:bCs/>
     </w:rPr>
   </w:style>
 </w:styles>

</xml_diff>